<commit_message>
update all files name as requirement end of assignmenta abd set the structure of all files
</commit_message>
<xml_diff>
--- a/templates/report_template.docx
+++ b/templates/report_template.docx
@@ -46,11 +46,7 @@
       </w:pPr>
       <w:r>
         <w:rPr/>
-        <w:t xml:space="preserve">Student Name: </w:t>
-      </w:r>
-      <w:r>
-        <w:rPr/>
-        <w:t>Sadam Hussain</w:t>
+        <w:t>Student Name: Sadam Hussain</w:t>
       </w:r>
     </w:p>
     <w:p>
@@ -60,11 +56,7 @@
       </w:pPr>
       <w:r>
         <w:rPr/>
-        <w:t xml:space="preserve">Roll Number: </w:t>
-      </w:r>
-      <w:r>
-        <w:rPr/>
-        <w:t>MSDS25069</w:t>
+        <w:t>Roll Number: MSDS25069</w:t>
       </w:r>
     </w:p>
     <w:p>
@@ -120,14 +112,7 @@
           <w:b/>
           <w:bCs/>
         </w:rPr>
-        <w:t xml:space="preserve">Q1: </w:t>
-      </w:r>
-      <w:r>
-        <w:rPr>
-          <w:b/>
-          <w:bCs/>
-        </w:rPr>
-        <w:t>Supervised Learning</w:t>
+        <w:t>Q1: Supervised Learning</w:t>
       </w:r>
     </w:p>
     <w:p>
@@ -173,15 +158,7 @@
           <w:b w:val="false"/>
           <w:bCs w:val="false"/>
         </w:rPr>
-        <w:t>The input features (X):</w:t>
-      </w:r>
-      <w:r>
-        <w:rPr>
-          <w:rStyle w:val="StrongEmphasis"/>
-          <w:b w:val="false"/>
-          <w:bCs w:val="false"/>
-        </w:rPr>
-        <w:t>T</w:t>
+        <w:t>The input features (X):T</w:t>
       </w:r>
       <w:r>
         <w:rPr/>
@@ -199,15 +176,7 @@
           <w:b w:val="false"/>
           <w:bCs w:val="false"/>
         </w:rPr>
-        <w:t xml:space="preserve">The output labels (y): </w:t>
-      </w:r>
-      <w:r>
-        <w:rPr>
-          <w:rStyle w:val="StrongEmphasis"/>
-          <w:b w:val="false"/>
-          <w:bCs w:val="false"/>
-        </w:rPr>
-        <w:t>T</w:t>
+        <w:t>The output labels (y): T</w:t>
       </w:r>
       <w:r>
         <w:rPr/>
@@ -225,15 +194,7 @@
           <w:b w:val="false"/>
           <w:bCs w:val="false"/>
         </w:rPr>
-        <w:t xml:space="preserve">The relationship between them: </w:t>
-      </w:r>
-      <w:r>
-        <w:rPr>
-          <w:rStyle w:val="StrongEmphasis"/>
-          <w:b w:val="false"/>
-          <w:bCs w:val="false"/>
-        </w:rPr>
-        <w:t>B</w:t>
+        <w:t>The relationship between them: B</w:t>
       </w:r>
       <w:r>
         <w:rPr/>
@@ -263,14 +224,7 @@
           <w:b/>
           <w:bCs/>
         </w:rPr>
-        <w:t xml:space="preserve">Q2: </w:t>
-      </w:r>
-      <w:r>
-        <w:rPr>
-          <w:b/>
-          <w:bCs/>
-        </w:rPr>
-        <w:t>labels are removed, do the images still contain useful visual structure</w:t>
+        <w:t>Q2: labels are removed, do the images still contain useful visual structure</w:t>
       </w:r>
     </w:p>
     <w:p>
@@ -518,11 +472,7 @@
       </w:pPr>
       <w:r>
         <w:rPr/>
-        <w:t xml:space="preserve">The </w:t>
-      </w:r>
-      <w:r>
-        <w:rPr/>
-        <w:t xml:space="preserve">labels are a human convenience for telling a model </w:t>
+        <w:t xml:space="preserve">The labels are a human convenience for telling a model </w:t>
       </w:r>
       <w:r>
         <w:rPr>
@@ -532,11 +482,7 @@
       </w:r>
       <w:r>
         <w:rPr/>
-        <w:t>, but the underlying statistical regularity in the data, what makes a horse look like a horse, exists independently of any labe</w:t>
-      </w:r>
-      <w:r>
-        <w:rPr/>
-        <w:t>l.</w:t>
+        <w:t>, but the underlying statistical regularity in the data, what makes a horse look like a horse, exists independently of any label.</w:t>
       </w:r>
     </w:p>
     <w:p>
@@ -553,14 +499,7 @@
           <w:b/>
           <w:bCs/>
         </w:rPr>
-        <w:t>Q3: T</w:t>
-      </w:r>
-      <w:r>
-        <w:rPr>
-          <w:b/>
-          <w:bCs/>
-        </w:rPr>
-        <w:t>wo augmented versions are created from the same original image, should their feature representations be similar or different?</w:t>
+        <w:t>Q3: Two augmented versions are created from the same original image, should their feature representations be similar or different?</w:t>
       </w:r>
     </w:p>
     <w:p>
@@ -656,28 +595,7 @@
           <w:b/>
           <w:bCs/>
         </w:rPr>
-        <w:t>Q</w:t>
-      </w:r>
-      <w:r>
-        <w:rPr>
-          <w:b/>
-          <w:bCs/>
-        </w:rPr>
-        <w:t>4</w:t>
-      </w:r>
-      <w:r>
-        <w:rPr>
-          <w:b/>
-          <w:bCs/>
-        </w:rPr>
-        <w:t xml:space="preserve">: </w:t>
-      </w:r>
-      <w:r>
-        <w:rPr>
-          <w:b/>
-          <w:bCs/>
-        </w:rPr>
-        <w:t>If two images come from different original images, should their feature representations be similar or different?</w:t>
+        <w:t>Q4: If two images come from different original images, should their feature representations be similar or different?</w:t>
       </w:r>
     </w:p>
     <w:p>
@@ -780,28 +698,7 @@
           <w:b/>
           <w:bCs/>
         </w:rPr>
-        <w:t>Q</w:t>
-      </w:r>
-      <w:r>
-        <w:rPr>
-          <w:b/>
-          <w:bCs/>
-        </w:rPr>
-        <w:t>5</w:t>
-      </w:r>
-      <w:r>
-        <w:rPr>
-          <w:b/>
-          <w:bCs/>
-        </w:rPr>
-        <w:t xml:space="preserve">: </w:t>
-      </w:r>
-      <w:r>
-        <w:rPr>
-          <w:b/>
-          <w:bCs/>
-        </w:rPr>
-        <w:t>Why might a model trained without labels still be useful for classification later?</w:t>
+        <w:t>Q5: Why might a model trained without labels still be useful for classification later?</w:t>
       </w:r>
     </w:p>
     <w:p>
@@ -907,28 +804,7 @@
           <w:b/>
           <w:bCs/>
         </w:rPr>
-        <w:t>Q</w:t>
-      </w:r>
-      <w:r>
-        <w:rPr>
-          <w:b/>
-          <w:bCs/>
-        </w:rPr>
-        <w:t>6</w:t>
-      </w:r>
-      <w:r>
-        <w:rPr>
-          <w:b/>
-          <w:bCs/>
-        </w:rPr>
-        <w:t xml:space="preserve">: </w:t>
-      </w:r>
-      <w:r>
-        <w:rPr>
-          <w:b/>
-          <w:bCs/>
-        </w:rPr>
-        <w:t>What is the difference between pretraining and fine-tuning?</w:t>
+        <w:t>Q6: What is the difference between pretraining and fine-tuning?</w:t>
       </w:r>
     </w:p>
     <w:p>
@@ -1109,8 +985,8 @@
       </w:pPr>
       <w:r>
         <w:rPr>
-          <w:b/>
-          <w:bCs/>
+          <w:b w:val="false"/>
+          <w:bCs w:val="false"/>
         </w:rPr>
       </w:r>
     </w:p>
@@ -1286,6 +1162,7 @@
                 <w:szCs w:val="22"/>
                 <w:lang w:val="en-US" w:eastAsia="en-US" w:bidi="ar-SA"/>
               </w:rPr>
+              <w:t>64</w:t>
             </w:r>
           </w:p>
         </w:tc>
@@ -1352,6 +1229,7 @@
                 <w:szCs w:val="22"/>
                 <w:lang w:val="en-US" w:eastAsia="en-US" w:bidi="ar-SA"/>
               </w:rPr>
+              <w:t>50</w:t>
             </w:r>
           </w:p>
         </w:tc>
@@ -1748,6 +1626,7 @@
                 <w:szCs w:val="22"/>
                 <w:lang w:val="en-US" w:eastAsia="en-US" w:bidi="ar-SA"/>
               </w:rPr>
+              <w:t>GPU</w:t>
             </w:r>
           </w:p>
         </w:tc>
@@ -1814,6 +1693,7 @@
                 <w:szCs w:val="22"/>
                 <w:lang w:val="en-US" w:eastAsia="en-US" w:bidi="ar-SA"/>
               </w:rPr>
+              <w:t>6 hours</w:t>
             </w:r>
           </w:p>
         </w:tc>

</xml_diff>

<commit_message>
update the naming convention of files
</commit_message>
<xml_diff>
--- a/templates/report_template.docx
+++ b/templates/report_template.docx
@@ -46,11 +46,7 @@
       </w:pPr>
       <w:r>
         <w:rPr/>
-        <w:t xml:space="preserve">Student Name: </w:t>
-      </w:r>
-      <w:r>
-        <w:rPr/>
-        <w:t>Sadam Hussain</w:t>
+        <w:t>Student Name: Sadam Hussain</w:t>
       </w:r>
     </w:p>
     <w:p>
@@ -60,11 +56,7 @@
       </w:pPr>
       <w:r>
         <w:rPr/>
-        <w:t xml:space="preserve">Roll Number: </w:t>
-      </w:r>
-      <w:r>
-        <w:rPr/>
-        <w:t>MSDS25069</w:t>
+        <w:t>Roll Number: MSDS25069</w:t>
       </w:r>
     </w:p>
     <w:p>
@@ -120,14 +112,7 @@
           <w:b/>
           <w:bCs/>
         </w:rPr>
-        <w:t xml:space="preserve">Q1: </w:t>
-      </w:r>
-      <w:r>
-        <w:rPr>
-          <w:b/>
-          <w:bCs/>
-        </w:rPr>
-        <w:t>Supervised Learning</w:t>
+        <w:t>Q1: Supervised Learning</w:t>
       </w:r>
     </w:p>
     <w:p>
@@ -173,19 +158,29 @@
           <w:b w:val="false"/>
           <w:bCs w:val="false"/>
         </w:rPr>
-        <w:t>The input features (X):</w:t>
+        <w:t>The input features (X):T</w:t>
       </w:r>
+      <w:r>
+        <w:rPr/>
+        <w:t>he measurable attributes or variables that describe each example (e.g., pixel values in an image, word frequencies in a document).</w:t>
+      </w:r>
+    </w:p>
+    <w:p>
+      <w:pPr>
+        <w:pStyle w:val="TextBody"/>
+        <w:rPr/>
+      </w:pPr>
       <w:r>
         <w:rPr>
           <w:rStyle w:val="StrongEmphasis"/>
           <w:b w:val="false"/>
           <w:bCs w:val="false"/>
         </w:rPr>
-        <w:t>T</w:t>
+        <w:t>The output labels (y): T</w:t>
       </w:r>
       <w:r>
         <w:rPr/>
-        <w:t>he measurable attributes or variables that describe each example (e.g., pixel values in an image, word frequencies in a document).</w:t>
+        <w:t>he correct category or class assigned to each example (e.g., "spam/not spam", "cat/dog", "malignant/benign").</w:t>
       </w:r>
     </w:p>
     <w:p>
@@ -199,41 +194,7 @@
           <w:b w:val="false"/>
           <w:bCs w:val="false"/>
         </w:rPr>
-        <w:t xml:space="preserve">The output labels (y): </w:t>
-      </w:r>
-      <w:r>
-        <w:rPr>
-          <w:rStyle w:val="StrongEmphasis"/>
-          <w:b w:val="false"/>
-          <w:bCs w:val="false"/>
-        </w:rPr>
-        <w:t>T</w:t>
-      </w:r>
-      <w:r>
-        <w:rPr/>
-        <w:t>he correct category or class assigned to each example (e.g., "spam/not spam", "cat/dog", "malignant/benign").</w:t>
-      </w:r>
-    </w:p>
-    <w:p>
-      <w:pPr>
-        <w:pStyle w:val="TextBody"/>
-        <w:rPr/>
-      </w:pPr>
-      <w:r>
-        <w:rPr>
-          <w:rStyle w:val="StrongEmphasis"/>
-          <w:b w:val="false"/>
-          <w:bCs w:val="false"/>
-        </w:rPr>
-        <w:t xml:space="preserve">The relationship between them: </w:t>
-      </w:r>
-      <w:r>
-        <w:rPr>
-          <w:rStyle w:val="StrongEmphasis"/>
-          <w:b w:val="false"/>
-          <w:bCs w:val="false"/>
-        </w:rPr>
-        <w:t>B</w:t>
+        <w:t>The relationship between them: B</w:t>
       </w:r>
       <w:r>
         <w:rPr/>
@@ -263,14 +224,7 @@
           <w:b/>
           <w:bCs/>
         </w:rPr>
-        <w:t xml:space="preserve">Q2: </w:t>
-      </w:r>
-      <w:r>
-        <w:rPr>
-          <w:b/>
-          <w:bCs/>
-        </w:rPr>
-        <w:t>labels are removed, do the images still contain useful visual structure</w:t>
+        <w:t>Q2: labels are removed, do the images still contain useful visual structure</w:t>
       </w:r>
     </w:p>
     <w:p>
@@ -518,11 +472,7 @@
       </w:pPr>
       <w:r>
         <w:rPr/>
-        <w:t xml:space="preserve">The </w:t>
-      </w:r>
-      <w:r>
-        <w:rPr/>
-        <w:t xml:space="preserve">labels are a human convenience for telling a model </w:t>
+        <w:t xml:space="preserve">The labels are a human convenience for telling a model </w:t>
       </w:r>
       <w:r>
         <w:rPr>
@@ -532,11 +482,7 @@
       </w:r>
       <w:r>
         <w:rPr/>
-        <w:t>, but the underlying statistical regularity in the data, what makes a horse look like a horse, exists independently of any labe</w:t>
-      </w:r>
-      <w:r>
-        <w:rPr/>
-        <w:t>l.</w:t>
+        <w:t>, but the underlying statistical regularity in the data, what makes a horse look like a horse, exists independently of any label.</w:t>
       </w:r>
     </w:p>
     <w:p>
@@ -553,14 +499,7 @@
           <w:b/>
           <w:bCs/>
         </w:rPr>
-        <w:t>Q3: T</w:t>
-      </w:r>
-      <w:r>
-        <w:rPr>
-          <w:b/>
-          <w:bCs/>
-        </w:rPr>
-        <w:t>wo augmented versions are created from the same original image, should their feature representations be similar or different?</w:t>
+        <w:t>Q3: Two augmented versions are created from the same original image, should their feature representations be similar or different?</w:t>
       </w:r>
     </w:p>
     <w:p>
@@ -656,28 +595,7 @@
           <w:b/>
           <w:bCs/>
         </w:rPr>
-        <w:t>Q</w:t>
-      </w:r>
-      <w:r>
-        <w:rPr>
-          <w:b/>
-          <w:bCs/>
-        </w:rPr>
-        <w:t>4</w:t>
-      </w:r>
-      <w:r>
-        <w:rPr>
-          <w:b/>
-          <w:bCs/>
-        </w:rPr>
-        <w:t xml:space="preserve">: </w:t>
-      </w:r>
-      <w:r>
-        <w:rPr>
-          <w:b/>
-          <w:bCs/>
-        </w:rPr>
-        <w:t>If two images come from different original images, should their feature representations be similar or different?</w:t>
+        <w:t>Q4: If two images come from different original images, should their feature representations be similar or different?</w:t>
       </w:r>
     </w:p>
     <w:p>
@@ -780,28 +698,7 @@
           <w:b/>
           <w:bCs/>
         </w:rPr>
-        <w:t>Q</w:t>
-      </w:r>
-      <w:r>
-        <w:rPr>
-          <w:b/>
-          <w:bCs/>
-        </w:rPr>
-        <w:t>5</w:t>
-      </w:r>
-      <w:r>
-        <w:rPr>
-          <w:b/>
-          <w:bCs/>
-        </w:rPr>
-        <w:t xml:space="preserve">: </w:t>
-      </w:r>
-      <w:r>
-        <w:rPr>
-          <w:b/>
-          <w:bCs/>
-        </w:rPr>
-        <w:t>Why might a model trained without labels still be useful for classification later?</w:t>
+        <w:t>Q5: Why might a model trained without labels still be useful for classification later?</w:t>
       </w:r>
     </w:p>
     <w:p>
@@ -907,28 +804,7 @@
           <w:b/>
           <w:bCs/>
         </w:rPr>
-        <w:t>Q</w:t>
-      </w:r>
-      <w:r>
-        <w:rPr>
-          <w:b/>
-          <w:bCs/>
-        </w:rPr>
-        <w:t>6</w:t>
-      </w:r>
-      <w:r>
-        <w:rPr>
-          <w:b/>
-          <w:bCs/>
-        </w:rPr>
-        <w:t xml:space="preserve">: </w:t>
-      </w:r>
-      <w:r>
-        <w:rPr>
-          <w:b/>
-          <w:bCs/>
-        </w:rPr>
-        <w:t>What is the difference between pretraining and fine-tuning?</w:t>
+        <w:t>Q6: What is the difference between pretraining and fine-tuning?</w:t>
       </w:r>
     </w:p>
     <w:p>
@@ -1109,8 +985,8 @@
       </w:pPr>
       <w:r>
         <w:rPr>
-          <w:b/>
-          <w:bCs/>
+          <w:b w:val="false"/>
+          <w:bCs w:val="false"/>
         </w:rPr>
       </w:r>
     </w:p>
@@ -1286,6 +1162,7 @@
                 <w:szCs w:val="22"/>
                 <w:lang w:val="en-US" w:eastAsia="en-US" w:bidi="ar-SA"/>
               </w:rPr>
+              <w:t>64</w:t>
             </w:r>
           </w:p>
         </w:tc>
@@ -1352,6 +1229,7 @@
                 <w:szCs w:val="22"/>
                 <w:lang w:val="en-US" w:eastAsia="en-US" w:bidi="ar-SA"/>
               </w:rPr>
+              <w:t>50</w:t>
             </w:r>
           </w:p>
         </w:tc>
@@ -1418,6 +1296,7 @@
                 <w:szCs w:val="22"/>
                 <w:lang w:val="en-US" w:eastAsia="en-US" w:bidi="ar-SA"/>
               </w:rPr>
+              <w:t>20</w:t>
             </w:r>
           </w:p>
         </w:tc>
@@ -1484,6 +1363,7 @@
                 <w:szCs w:val="22"/>
                 <w:lang w:val="en-US" w:eastAsia="en-US" w:bidi="ar-SA"/>
               </w:rPr>
+              <w:t>20</w:t>
             </w:r>
           </w:p>
         </w:tc>
@@ -1550,6 +1430,7 @@
                 <w:szCs w:val="22"/>
                 <w:lang w:val="en-US" w:eastAsia="en-US" w:bidi="ar-SA"/>
               </w:rPr>
+              <w:t>0.0003</w:t>
             </w:r>
           </w:p>
         </w:tc>
@@ -1616,6 +1497,7 @@
                 <w:szCs w:val="22"/>
                 <w:lang w:val="en-US" w:eastAsia="en-US" w:bidi="ar-SA"/>
               </w:rPr>
+              <w:t>Adam</w:t>
             </w:r>
           </w:p>
         </w:tc>
@@ -1682,6 +1564,7 @@
                 <w:szCs w:val="22"/>
                 <w:lang w:val="en-US" w:eastAsia="en-US" w:bidi="ar-SA"/>
               </w:rPr>
+              <w:t>0.5</w:t>
             </w:r>
           </w:p>
         </w:tc>
@@ -1748,6 +1631,7 @@
                 <w:szCs w:val="22"/>
                 <w:lang w:val="en-US" w:eastAsia="en-US" w:bidi="ar-SA"/>
               </w:rPr>
+              <w:t>GPU</w:t>
             </w:r>
           </w:p>
         </w:tc>
@@ -1814,6 +1698,70 @@
                 <w:szCs w:val="22"/>
                 <w:lang w:val="en-US" w:eastAsia="en-US" w:bidi="ar-SA"/>
               </w:rPr>
+              <w:t>~3.1 h</w:t>
+            </w:r>
+            <w:r>
+              <w:rPr>
+                <w:rFonts w:eastAsia="ＭＳ 明朝" w:cs=""/>
+                <w:caps w:val="false"/>
+                <w:smallCaps w:val="false"/>
+                <w:spacing w:val="0"/>
+                <w:kern w:val="0"/>
+                <w:szCs w:val="22"/>
+                <w:lang w:val="en-US" w:eastAsia="en-US" w:bidi="ar-SA"/>
+              </w:rPr>
+              <w:t> </w:t>
+            </w:r>
+            <w:r>
+              <w:rPr>
+                <w:rFonts w:eastAsia="ＭＳ 明朝" w:cs="" w:ascii="system-ui;Ubuntu;Droid Sans;sans-serif" w:hAnsi="system-ui;Ubuntu;Droid Sans;sans-serif"/>
+                <w:b w:val="false"/>
+                <w:i w:val="false"/>
+                <w:caps w:val="false"/>
+                <w:smallCaps w:val="false"/>
+                <w:spacing w:val="0"/>
+                <w:kern w:val="0"/>
+                <w:sz w:val="20"/>
+                <w:szCs w:val="22"/>
+                <w:lang w:val="en-US" w:eastAsia="en-US" w:bidi="ar-SA"/>
+              </w:rPr>
+              <w:t>SimCLR only (186.5 min); </w:t>
+            </w:r>
+            <w:r>
+              <w:rPr>
+                <w:rFonts w:eastAsia="ＭＳ 明朝" w:cs=""/>
+                <w:kern w:val="0"/>
+                <w:szCs w:val="22"/>
+                <w:lang w:val="en-US" w:eastAsia="en-US" w:bidi="ar-SA"/>
+              </w:rPr>
+              <w:t>~6+ h</w:t>
+            </w:r>
+            <w:r>
+              <w:rPr>
+                <w:rFonts w:eastAsia="ＭＳ 明朝" w:cs=""/>
+                <w:caps w:val="false"/>
+                <w:smallCaps w:val="false"/>
+                <w:spacing w:val="0"/>
+                <w:kern w:val="0"/>
+                <w:szCs w:val="22"/>
+                <w:lang w:val="en-US" w:eastAsia="en-US" w:bidi="ar-SA"/>
+              </w:rPr>
+              <w:t> </w:t>
+            </w:r>
+            <w:r>
+              <w:rPr>
+                <w:rFonts w:eastAsia="ＭＳ 明朝" w:cs="" w:ascii="system-ui;Ubuntu;Droid Sans;sans-serif" w:hAnsi="system-ui;Ubuntu;Droid Sans;sans-serif"/>
+                <w:b w:val="false"/>
+                <w:i w:val="false"/>
+                <w:caps w:val="false"/>
+                <w:smallCaps w:val="false"/>
+                <w:spacing w:val="0"/>
+                <w:kern w:val="0"/>
+                <w:sz w:val="20"/>
+                <w:szCs w:val="22"/>
+                <w:lang w:val="en-US" w:eastAsia="en-US" w:bidi="ar-SA"/>
+              </w:rPr>
+              <w:t>total if you include linear probe + all fine-tuning runs</w:t>
             </w:r>
           </w:p>
         </w:tc>
@@ -1850,6 +1798,160 @@
     </w:p>
     <w:p>
       <w:pPr>
+        <w:pStyle w:val="Normal"/>
+        <w:rPr/>
+      </w:pPr>
+      <w:r>
+        <w:rPr/>
+        <w:t xml:space="preserve">  </w:t>
+      </w:r>
+      <w:r>
+        <w:rPr/>
+        <w:t>"test_accuracy": 0.7659</w:t>
+      </w:r>
+    </w:p>
+    <w:p>
+      <w:pPr>
+        <w:pStyle w:val="Normal"/>
+        <w:rPr/>
+      </w:pPr>
+      <w:r>
+        <w:rPr/>
+        <w:t xml:space="preserve">  </w:t>
+      </w:r>
+      <w:r>
+        <w:rPr/>
+        <w:t>"best_val_accuracy": 0.7628</w:t>
+      </w:r>
+    </w:p>
+    <w:p>
+      <w:pPr>
+        <w:pStyle w:val="Normal"/>
+        <w:rPr/>
+      </w:pPr>
+      <w:r>
+        <w:rPr/>
+        <w:drawing>
+          <wp:anchor behindDoc="0" distT="0" distB="0" distL="0" distR="0" simplePos="0" locked="0" layoutInCell="0" allowOverlap="1" relativeHeight="2">
+            <wp:simplePos x="0" y="0"/>
+            <wp:positionH relativeFrom="column">
+              <wp:align>center</wp:align>
+            </wp:positionH>
+            <wp:positionV relativeFrom="paragraph">
+              <wp:posOffset>635</wp:posOffset>
+            </wp:positionV>
+            <wp:extent cx="6400800" cy="3840480"/>
+            <wp:effectExtent l="0" t="0" r="0" b="0"/>
+            <wp:wrapSquare wrapText="largest"/>
+            <wp:docPr id="1" name="Image1" descr=""/>
+            <wp:cNvGraphicFramePr>
+              <a:graphicFrameLocks xmlns:a="http://schemas.openxmlformats.org/drawingml/2006/main" noChangeAspect="1"/>
+            </wp:cNvGraphicFramePr>
+            <a:graphic xmlns:a="http://schemas.openxmlformats.org/drawingml/2006/main">
+              <a:graphicData uri="http://schemas.openxmlformats.org/drawingml/2006/picture">
+                <pic:pic xmlns:pic="http://schemas.openxmlformats.org/drawingml/2006/picture">
+                  <pic:nvPicPr>
+                    <pic:cNvPr id="1" name="Image1" descr=""/>
+                    <pic:cNvPicPr>
+                      <a:picLocks noChangeAspect="1" noChangeArrowheads="1"/>
+                    </pic:cNvPicPr>
+                  </pic:nvPicPr>
+                  <pic:blipFill>
+                    <a:blip r:embed="rId2"/>
+                    <a:stretch>
+                      <a:fillRect/>
+                    </a:stretch>
+                  </pic:blipFill>
+                  <pic:spPr bwMode="auto">
+                    <a:xfrm>
+                      <a:off x="0" y="0"/>
+                      <a:ext cx="6400800" cy="3840480"/>
+                    </a:xfrm>
+                    <a:prstGeom prst="rect">
+                      <a:avLst/>
+                    </a:prstGeom>
+                  </pic:spPr>
+                </pic:pic>
+              </a:graphicData>
+            </a:graphic>
+          </wp:anchor>
+        </w:drawing>
+        <w:drawing>
+          <wp:anchor behindDoc="0" distT="0" distB="0" distL="0" distR="0" simplePos="0" locked="0" layoutInCell="0" allowOverlap="1" relativeHeight="3">
+            <wp:simplePos x="0" y="0"/>
+            <wp:positionH relativeFrom="column">
+              <wp:align>center</wp:align>
+            </wp:positionH>
+            <wp:positionV relativeFrom="paragraph">
+              <wp:posOffset>635</wp:posOffset>
+            </wp:positionV>
+            <wp:extent cx="6400800" cy="5120640"/>
+            <wp:effectExtent l="0" t="0" r="0" b="0"/>
+            <wp:wrapSquare wrapText="largest"/>
+            <wp:docPr id="2" name="Image2" descr=""/>
+            <wp:cNvGraphicFramePr>
+              <a:graphicFrameLocks xmlns:a="http://schemas.openxmlformats.org/drawingml/2006/main" noChangeAspect="1"/>
+            </wp:cNvGraphicFramePr>
+            <a:graphic xmlns:a="http://schemas.openxmlformats.org/drawingml/2006/main">
+              <a:graphicData uri="http://schemas.openxmlformats.org/drawingml/2006/picture">
+                <pic:pic xmlns:pic="http://schemas.openxmlformats.org/drawingml/2006/picture">
+                  <pic:nvPicPr>
+                    <pic:cNvPr id="2" name="Image2" descr=""/>
+                    <pic:cNvPicPr>
+                      <a:picLocks noChangeAspect="1" noChangeArrowheads="1"/>
+                    </pic:cNvPicPr>
+                  </pic:nvPicPr>
+                  <pic:blipFill>
+                    <a:blip r:embed="rId3"/>
+                    <a:stretch>
+                      <a:fillRect/>
+                    </a:stretch>
+                  </pic:blipFill>
+                  <pic:spPr bwMode="auto">
+                    <a:xfrm>
+                      <a:off x="0" y="0"/>
+                      <a:ext cx="6400800" cy="5120640"/>
+                    </a:xfrm>
+                    <a:prstGeom prst="rect">
+                      <a:avLst/>
+                    </a:prstGeom>
+                  </pic:spPr>
+                </pic:pic>
+              </a:graphicData>
+            </a:graphic>
+          </wp:anchor>
+        </w:drawing>
+      </w:r>
+    </w:p>
+    <w:p>
+      <w:pPr>
+        <w:pStyle w:val="Normal"/>
+        <w:rPr/>
+      </w:pPr>
+      <w:r>
+        <w:rPr/>
+      </w:r>
+    </w:p>
+    <w:p>
+      <w:pPr>
+        <w:pStyle w:val="Normal"/>
+        <w:rPr/>
+      </w:pPr>
+      <w:r>
+        <w:rPr/>
+      </w:r>
+    </w:p>
+    <w:p>
+      <w:pPr>
+        <w:pStyle w:val="Normal"/>
+        <w:rPr/>
+      </w:pPr>
+      <w:r>
+        <w:rPr/>
+      </w:r>
+    </w:p>
+    <w:p>
+      <w:pPr>
         <w:pStyle w:val="Heading1"/>
         <w:rPr/>
       </w:pPr>
@@ -1870,6 +1972,106 @@
     </w:p>
     <w:p>
       <w:pPr>
+        <w:pStyle w:val="Normal"/>
+        <w:widowControl/>
+        <w:ind w:left="0" w:right="0" w:hanging="0"/>
+        <w:rPr>
+          <w:rFonts w:ascii="system-ui;Ubuntu;Droid Sans;sans-serif" w:hAnsi="system-ui;Ubuntu;Droid Sans;sans-serif"/>
+          <w:b w:val="false"/>
+          <w:i w:val="false"/>
+          <w:caps w:val="false"/>
+          <w:smallCaps w:val="false"/>
+          <w:spacing w:val="0"/>
+          <w:sz w:val="20"/>
+        </w:rPr>
+      </w:pPr>
+      <w:r>
+        <w:rPr>
+          <w:rFonts w:ascii="system-ui;Ubuntu;Droid Sans;sans-serif" w:hAnsi="system-ui;Ubuntu;Droid Sans;sans-serif"/>
+          <w:b w:val="false"/>
+          <w:i w:val="false"/>
+          <w:caps w:val="false"/>
+          <w:smallCaps w:val="false"/>
+          <w:spacing w:val="0"/>
+          <w:sz w:val="20"/>
+        </w:rPr>
+        <w:t>yes — crops/flips/jitter should not change class</w:t>
+      </w:r>
+    </w:p>
+    <w:p>
+      <w:pPr>
+        <w:pStyle w:val="Normal"/>
+        <w:rPr/>
+      </w:pPr>
+      <w:r>
+        <w:rPr/>
+      </w:r>
+    </w:p>
+    <w:p>
+      <w:pPr>
+        <w:pStyle w:val="Normal"/>
+        <w:rPr/>
+      </w:pPr>
+      <w:r>
+        <w:rPr/>
+        <w:drawing>
+          <wp:anchor behindDoc="0" distT="0" distB="0" distL="0" distR="0" simplePos="0" locked="0" layoutInCell="0" allowOverlap="1" relativeHeight="4">
+            <wp:simplePos x="0" y="0"/>
+            <wp:positionH relativeFrom="column">
+              <wp:align>center</wp:align>
+            </wp:positionH>
+            <wp:positionV relativeFrom="paragraph">
+              <wp:align>top</wp:align>
+            </wp:positionV>
+            <wp:extent cx="6400800" cy="9944100"/>
+            <wp:effectExtent l="0" t="0" r="0" b="0"/>
+            <wp:wrapSquare wrapText="largest"/>
+            <wp:docPr id="3" name="Image3" descr=""/>
+            <wp:cNvGraphicFramePr>
+              <a:graphicFrameLocks xmlns:a="http://schemas.openxmlformats.org/drawingml/2006/main" noChangeAspect="1"/>
+            </wp:cNvGraphicFramePr>
+            <a:graphic xmlns:a="http://schemas.openxmlformats.org/drawingml/2006/main">
+              <a:graphicData uri="http://schemas.openxmlformats.org/drawingml/2006/picture">
+                <pic:pic xmlns:pic="http://schemas.openxmlformats.org/drawingml/2006/picture">
+                  <pic:nvPicPr>
+                    <pic:cNvPr id="3" name="Image3" descr=""/>
+                    <pic:cNvPicPr>
+                      <a:picLocks noChangeAspect="1" noChangeArrowheads="1"/>
+                    </pic:cNvPicPr>
+                  </pic:nvPicPr>
+                  <pic:blipFill>
+                    <a:blip r:embed="rId4"/>
+                    <a:stretch>
+                      <a:fillRect/>
+                    </a:stretch>
+                  </pic:blipFill>
+                  <pic:spPr bwMode="auto">
+                    <a:xfrm>
+                      <a:off x="0" y="0"/>
+                      <a:ext cx="6400800" cy="9944100"/>
+                    </a:xfrm>
+                    <a:prstGeom prst="rect">
+                      <a:avLst/>
+                    </a:prstGeom>
+                  </pic:spPr>
+                </pic:pic>
+              </a:graphicData>
+            </a:graphic>
+          </wp:anchor>
+        </w:drawing>
+      </w:r>
+    </w:p>
+    <w:p>
+      <w:pPr>
+        <w:pStyle w:val="Normal"/>
+        <w:rPr/>
+      </w:pPr>
+      <w:r>
+        <w:rPr/>
+      </w:r>
+    </w:p>
+    <w:p>
+      <w:pPr>
         <w:pStyle w:val="Heading1"/>
         <w:rPr/>
       </w:pPr>
@@ -1890,6 +2092,121 @@
     </w:p>
     <w:p>
       <w:pPr>
+        <w:pStyle w:val="Normal"/>
+        <w:widowControl/>
+        <w:ind w:left="0" w:right="0" w:hanging="0"/>
+        <w:rPr/>
+      </w:pPr>
+      <w:r>
+        <w:rPr/>
+        <w:t>Interpretation:</w:t>
+      </w:r>
+      <w:r>
+        <w:rPr>
+          <w:caps w:val="false"/>
+          <w:smallCaps w:val="false"/>
+          <w:spacing w:val="0"/>
+        </w:rPr>
+        <w:t> </w:t>
+      </w:r>
+      <w:r>
+        <w:rPr>
+          <w:rFonts w:ascii="system-ui;Ubuntu;Droid Sans;sans-serif" w:hAnsi="system-ui;Ubuntu;Droid Sans;sans-serif"/>
+          <w:b w:val="false"/>
+          <w:i w:val="false"/>
+          <w:caps w:val="false"/>
+          <w:smallCaps w:val="false"/>
+          <w:spacing w:val="0"/>
+          <w:sz w:val="20"/>
+        </w:rPr>
+        <w:t>Before training, representations are almost equally similar for same and different images (no useful structure yet).</w:t>
+      </w:r>
+    </w:p>
+    <w:p>
+      <w:pPr>
+        <w:pStyle w:val="Normal"/>
+        <w:widowControl/>
+        <w:ind w:left="0" w:right="0" w:hanging="0"/>
+        <w:rPr>
+          <w:rFonts w:ascii="system-ui;Ubuntu;Droid Sans;sans-serif" w:hAnsi="system-ui;Ubuntu;Droid Sans;sans-serif"/>
+          <w:b w:val="false"/>
+          <w:i w:val="false"/>
+          <w:caps w:val="false"/>
+          <w:smallCaps w:val="false"/>
+          <w:spacing w:val="0"/>
+          <w:sz w:val="20"/>
+        </w:rPr>
+      </w:pPr>
+      <w:r>
+        <w:rPr/>
+        <w:drawing>
+          <wp:anchor behindDoc="0" distT="0" distB="0" distL="0" distR="0" simplePos="0" locked="0" layoutInCell="0" allowOverlap="1" relativeHeight="5">
+            <wp:simplePos x="0" y="0"/>
+            <wp:positionH relativeFrom="column">
+              <wp:align>center</wp:align>
+            </wp:positionH>
+            <wp:positionV relativeFrom="paragraph">
+              <wp:posOffset>635</wp:posOffset>
+            </wp:positionV>
+            <wp:extent cx="6400800" cy="6532245"/>
+            <wp:effectExtent l="0" t="0" r="0" b="0"/>
+            <wp:wrapSquare wrapText="largest"/>
+            <wp:docPr id="4" name="Image4" descr=""/>
+            <wp:cNvGraphicFramePr>
+              <a:graphicFrameLocks xmlns:a="http://schemas.openxmlformats.org/drawingml/2006/main" noChangeAspect="1"/>
+            </wp:cNvGraphicFramePr>
+            <a:graphic xmlns:a="http://schemas.openxmlformats.org/drawingml/2006/main">
+              <a:graphicData uri="http://schemas.openxmlformats.org/drawingml/2006/picture">
+                <pic:pic xmlns:pic="http://schemas.openxmlformats.org/drawingml/2006/picture">
+                  <pic:nvPicPr>
+                    <pic:cNvPr id="4" name="Image4" descr=""/>
+                    <pic:cNvPicPr>
+                      <a:picLocks noChangeAspect="1" noChangeArrowheads="1"/>
+                    </pic:cNvPicPr>
+                  </pic:nvPicPr>
+                  <pic:blipFill>
+                    <a:blip r:embed="rId5"/>
+                    <a:stretch>
+                      <a:fillRect/>
+                    </a:stretch>
+                  </pic:blipFill>
+                  <pic:spPr bwMode="auto">
+                    <a:xfrm>
+                      <a:off x="0" y="0"/>
+                      <a:ext cx="6400800" cy="6532245"/>
+                    </a:xfrm>
+                    <a:prstGeom prst="rect">
+                      <a:avLst/>
+                    </a:prstGeom>
+                  </pic:spPr>
+                </pic:pic>
+              </a:graphicData>
+            </a:graphic>
+          </wp:anchor>
+        </w:drawing>
+      </w:r>
+    </w:p>
+    <w:p>
+      <w:pPr>
+        <w:pStyle w:val="Normal"/>
+        <w:widowControl/>
+        <w:ind w:left="0" w:right="0" w:hanging="0"/>
+        <w:rPr>
+          <w:rFonts w:ascii="system-ui;Ubuntu;Droid Sans;sans-serif" w:hAnsi="system-ui;Ubuntu;Droid Sans;sans-serif"/>
+          <w:b w:val="false"/>
+          <w:i w:val="false"/>
+          <w:caps w:val="false"/>
+          <w:smallCaps w:val="false"/>
+          <w:spacing w:val="0"/>
+          <w:sz w:val="20"/>
+        </w:rPr>
+      </w:pPr>
+      <w:r>
+        <w:rPr/>
+      </w:r>
+    </w:p>
+    <w:p>
+      <w:pPr>
         <w:pStyle w:val="Heading1"/>
         <w:rPr/>
       </w:pPr>
@@ -1910,6 +2227,235 @@
     </w:p>
     <w:p>
       <w:pPr>
+        <w:pStyle w:val="Normal"/>
+        <w:rPr/>
+      </w:pPr>
+      <w:r>
+        <w:rPr/>
+      </w:r>
+    </w:p>
+    <w:p>
+      <w:pPr>
+        <w:pStyle w:val="TextBody"/>
+        <w:rPr/>
+      </w:pPr>
+      <w:r>
+        <w:rPr/>
+        <w:t>Architecture (from your log):</w:t>
+      </w:r>
+    </w:p>
+    <w:p>
+      <w:pPr>
+        <w:pStyle w:val="TextBody"/>
+        <w:numPr>
+          <w:ilvl w:val="0"/>
+          <w:numId w:val="10"/>
+        </w:numPr>
+        <w:pBdr/>
+        <w:tabs>
+          <w:tab w:val="clear" w:pos="720"/>
+          <w:tab w:val="left" w:pos="0" w:leader="none"/>
+        </w:tabs>
+        <w:spacing w:before="0" w:after="0"/>
+        <w:ind w:left="709" w:hanging="283"/>
+        <w:rPr/>
+      </w:pPr>
+      <w:r>
+        <w:rPr/>
+        <w:t>Encoder: ResNet-18 (CIFAR) → 512-dim</w:t>
+      </w:r>
+    </w:p>
+    <w:p>
+      <w:pPr>
+        <w:pStyle w:val="TextBody"/>
+        <w:numPr>
+          <w:ilvl w:val="0"/>
+          <w:numId w:val="10"/>
+        </w:numPr>
+        <w:pBdr/>
+        <w:tabs>
+          <w:tab w:val="clear" w:pos="720"/>
+          <w:tab w:val="left" w:pos="0" w:leader="none"/>
+        </w:tabs>
+        <w:ind w:left="709" w:hanging="283"/>
+        <w:rPr/>
+      </w:pPr>
+      <w:r>
+        <w:rPr/>
+        <w:t>Projection head: Linear(512→256) → ReLU → Linear(256→128)</w:t>
+      </w:r>
+    </w:p>
+    <w:p>
+      <w:pPr>
+        <w:pStyle w:val="TextBody"/>
+        <w:rPr/>
+      </w:pPr>
+      <w:r>
+        <w:rPr/>
+        <w:t>Positive / negative pairs (example batch size 4):</w:t>
+      </w:r>
+    </w:p>
+    <w:p>
+      <w:pPr>
+        <w:pStyle w:val="TextBody"/>
+        <w:numPr>
+          <w:ilvl w:val="0"/>
+          <w:numId w:val="11"/>
+        </w:numPr>
+        <w:pBdr/>
+        <w:tabs>
+          <w:tab w:val="clear" w:pos="720"/>
+          <w:tab w:val="left" w:pos="0" w:leader="none"/>
+        </w:tabs>
+        <w:spacing w:before="0" w:after="0"/>
+        <w:ind w:left="709" w:hanging="283"/>
+        <w:rPr/>
+      </w:pPr>
+      <w:r>
+        <w:rPr/>
+        <w:t>4 images → 8 augmented views</w:t>
+      </w:r>
+    </w:p>
+    <w:p>
+      <w:pPr>
+        <w:pStyle w:val="TextBody"/>
+        <w:numPr>
+          <w:ilvl w:val="0"/>
+          <w:numId w:val="11"/>
+        </w:numPr>
+        <w:pBdr/>
+        <w:tabs>
+          <w:tab w:val="clear" w:pos="720"/>
+          <w:tab w:val="left" w:pos="0" w:leader="none"/>
+        </w:tabs>
+        <w:spacing w:before="0" w:after="0"/>
+        <w:ind w:left="709" w:hanging="283"/>
+        <w:rPr/>
+      </w:pPr>
+      <w:r>
+        <w:rPr/>
+        <w:t>4 positive pairs (view1 ↔ view2 of same image)</w:t>
+      </w:r>
+    </w:p>
+    <w:p>
+      <w:pPr>
+        <w:pStyle w:val="TextBody"/>
+        <w:numPr>
+          <w:ilvl w:val="0"/>
+          <w:numId w:val="11"/>
+        </w:numPr>
+        <w:pBdr/>
+        <w:tabs>
+          <w:tab w:val="clear" w:pos="720"/>
+          <w:tab w:val="left" w:pos="0" w:leader="none"/>
+        </w:tabs>
+        <w:ind w:left="709" w:hanging="283"/>
+        <w:rPr/>
+      </w:pPr>
+      <w:r>
+        <w:rPr/>
+        <w:t>6 negatives per sample (other views in the batch)</w:t>
+      </w:r>
+    </w:p>
+    <w:p>
+      <w:pPr>
+        <w:pStyle w:val="TextBody"/>
+        <w:rPr/>
+      </w:pPr>
+      <w:r>
+        <w:rPr/>
+        <w:t>NT-Xent sanity check:</w:t>
+      </w:r>
+    </w:p>
+    <w:p>
+      <w:pPr>
+        <w:pStyle w:val="TextBody"/>
+        <w:numPr>
+          <w:ilvl w:val="0"/>
+          <w:numId w:val="12"/>
+        </w:numPr>
+        <w:pBdr/>
+        <w:tabs>
+          <w:tab w:val="clear" w:pos="720"/>
+          <w:tab w:val="left" w:pos="0" w:leader="none"/>
+        </w:tabs>
+        <w:spacing w:before="0" w:after="0"/>
+        <w:ind w:left="709" w:hanging="283"/>
+        <w:rPr/>
+      </w:pPr>
+      <w:r>
+        <w:rPr/>
+        <w:t>Random pairs loss: 3.9464</w:t>
+      </w:r>
+    </w:p>
+    <w:p>
+      <w:pPr>
+        <w:pStyle w:val="TextBody"/>
+        <w:numPr>
+          <w:ilvl w:val="0"/>
+          <w:numId w:val="12"/>
+        </w:numPr>
+        <w:pBdr/>
+        <w:tabs>
+          <w:tab w:val="clear" w:pos="720"/>
+          <w:tab w:val="left" w:pos="0" w:leader="none"/>
+        </w:tabs>
+        <w:ind w:left="709" w:hanging="283"/>
+        <w:rPr/>
+      </w:pPr>
+      <w:r>
+        <w:rPr/>
+        <w:t>Identical pairs loss: 1.3363 (lower → loss behaves sensibly)</w:t>
+      </w:r>
+    </w:p>
+    <w:p>
+      <w:pPr>
+        <w:pStyle w:val="TextBody"/>
+        <w:rPr/>
+      </w:pPr>
+      <w:r>
+        <w:rPr/>
+        <w:br/>
+      </w:r>
+      <w:r>
+        <w:rPr>
+          <w:rFonts w:ascii="system-ui;Ubuntu;Droid Sans;sans-serif" w:hAnsi="system-ui;Ubuntu;Droid Sans;sans-serif"/>
+          <w:b w:val="false"/>
+          <w:i w:val="false"/>
+          <w:caps w:val="false"/>
+          <w:smallCaps w:val="false"/>
+          <w:spacing w:val="0"/>
+          <w:sz w:val="20"/>
+        </w:rPr>
+        <w:t>cosine similarity matrix, </w:t>
+      </w:r>
+      <w:r>
+        <w:rPr/>
+        <w:t>mask diagonal</w:t>
+      </w:r>
+      <w:r>
+        <w:rPr>
+          <w:caps w:val="false"/>
+          <w:smallCaps w:val="false"/>
+          <w:spacing w:val="0"/>
+        </w:rPr>
+        <w:t> </w:t>
+      </w:r>
+      <w:r>
+        <w:rPr>
+          <w:rFonts w:ascii="system-ui;Ubuntu;Droid Sans;sans-serif" w:hAnsi="system-ui;Ubuntu;Droid Sans;sans-serif"/>
+          <w:b w:val="false"/>
+          <w:i w:val="false"/>
+          <w:caps w:val="false"/>
+          <w:smallCaps w:val="false"/>
+          <w:spacing w:val="0"/>
+          <w:sz w:val="20"/>
+        </w:rPr>
+        <w:t>(no self-comparison), NT-Xent pulls positives together and pushes negatives apart.</w:t>
+      </w:r>
+    </w:p>
+    <w:p>
+      <w:pPr>
         <w:pStyle w:val="Heading1"/>
         <w:rPr/>
       </w:pPr>
@@ -1930,6 +2476,929 @@
     </w:p>
     <w:p>
       <w:pPr>
+        <w:pStyle w:val="Normal"/>
+        <w:rPr/>
+      </w:pPr>
+      <w:r>
+        <w:rPr/>
+      </w:r>
+    </w:p>
+    <w:p>
+      <w:pPr>
+        <w:pStyle w:val="Normal"/>
+        <w:rPr/>
+      </w:pPr>
+      <w:r>
+        <w:rPr/>
+        <w:drawing>
+          <wp:anchor behindDoc="0" distT="0" distB="0" distL="0" distR="0" simplePos="0" locked="0" layoutInCell="0" allowOverlap="1" relativeHeight="6">
+            <wp:simplePos x="0" y="0"/>
+            <wp:positionH relativeFrom="column">
+              <wp:align>center</wp:align>
+            </wp:positionH>
+            <wp:positionV relativeFrom="paragraph">
+              <wp:posOffset>635</wp:posOffset>
+            </wp:positionV>
+            <wp:extent cx="6400800" cy="3840480"/>
+            <wp:effectExtent l="0" t="0" r="0" b="0"/>
+            <wp:wrapSquare wrapText="largest"/>
+            <wp:docPr id="5" name="Image5" descr=""/>
+            <wp:cNvGraphicFramePr>
+              <a:graphicFrameLocks xmlns:a="http://schemas.openxmlformats.org/drawingml/2006/main" noChangeAspect="1"/>
+            </wp:cNvGraphicFramePr>
+            <a:graphic xmlns:a="http://schemas.openxmlformats.org/drawingml/2006/main">
+              <a:graphicData uri="http://schemas.openxmlformats.org/drawingml/2006/picture">
+                <pic:pic xmlns:pic="http://schemas.openxmlformats.org/drawingml/2006/picture">
+                  <pic:nvPicPr>
+                    <pic:cNvPr id="5" name="Image5" descr=""/>
+                    <pic:cNvPicPr>
+                      <a:picLocks noChangeAspect="1" noChangeArrowheads="1"/>
+                    </pic:cNvPicPr>
+                  </pic:nvPicPr>
+                  <pic:blipFill>
+                    <a:blip r:embed="rId6"/>
+                    <a:stretch>
+                      <a:fillRect/>
+                    </a:stretch>
+                  </pic:blipFill>
+                  <pic:spPr bwMode="auto">
+                    <a:xfrm>
+                      <a:off x="0" y="0"/>
+                      <a:ext cx="6400800" cy="3840480"/>
+                    </a:xfrm>
+                    <a:prstGeom prst="rect">
+                      <a:avLst/>
+                    </a:prstGeom>
+                  </pic:spPr>
+                </pic:pic>
+              </a:graphicData>
+            </a:graphic>
+          </wp:anchor>
+        </w:drawing>
+      </w:r>
+    </w:p>
+    <w:p>
+      <w:pPr>
+        <w:pStyle w:val="TextBody"/>
+        <w:rPr/>
+      </w:pPr>
+      <w:r>
+        <w:rPr/>
+        <w:t>Training summary:</w:t>
+      </w:r>
+    </w:p>
+    <w:tbl>
+      <w:tblPr>
+        <w:tblW w:w="3365" w:type="dxa"/>
+        <w:jc w:val="left"/>
+        <w:tblInd w:w="0" w:type="dxa"/>
+        <w:tblLayout w:type="fixed"/>
+        <w:tblCellMar>
+          <w:top w:w="0" w:type="dxa"/>
+          <w:left w:w="0" w:type="dxa"/>
+          <w:bottom w:w="0" w:type="dxa"/>
+          <w:right w:w="0" w:type="dxa"/>
+        </w:tblCellMar>
+      </w:tblPr>
+      <w:tblGrid>
+        <w:gridCol w:w="1901"/>
+        <w:gridCol w:w="1464"/>
+      </w:tblGrid>
+      <w:tr>
+        <w:trPr>
+          <w:tblHeader w:val="true"/>
+        </w:trPr>
+        <w:tc>
+          <w:tcPr>
+            <w:tcW w:w="1901" w:type="dxa"/>
+            <w:tcBorders/>
+            <w:vAlign w:val="center"/>
+          </w:tcPr>
+          <w:p>
+            <w:pPr>
+              <w:pStyle w:val="TableHeading"/>
+              <w:spacing w:lineRule="auto" w:line="340" w:before="0" w:after="200"/>
+              <w:jc w:val="left"/>
+              <w:rPr>
+                <w:sz w:val="21"/>
+              </w:rPr>
+            </w:pPr>
+            <w:r>
+              <w:rPr>
+                <w:sz w:val="21"/>
+              </w:rPr>
+              <w:t>Item</w:t>
+            </w:r>
+          </w:p>
+        </w:tc>
+        <w:tc>
+          <w:tcPr>
+            <w:tcW w:w="1464" w:type="dxa"/>
+            <w:tcBorders/>
+            <w:vAlign w:val="center"/>
+          </w:tcPr>
+          <w:p>
+            <w:pPr>
+              <w:pStyle w:val="TableHeading"/>
+              <w:spacing w:lineRule="auto" w:line="340" w:before="0" w:after="200"/>
+              <w:jc w:val="left"/>
+              <w:rPr>
+                <w:sz w:val="21"/>
+              </w:rPr>
+            </w:pPr>
+            <w:r>
+              <w:rPr>
+                <w:sz w:val="21"/>
+              </w:rPr>
+              <w:t>Value</w:t>
+            </w:r>
+          </w:p>
+        </w:tc>
+      </w:tr>
+      <w:tr>
+        <w:trPr/>
+        <w:tc>
+          <w:tcPr>
+            <w:tcW w:w="1901" w:type="dxa"/>
+            <w:tcBorders>
+              <w:bottom w:val="single" w:sz="2" w:space="0" w:color="000000"/>
+              <w:right w:val="single" w:sz="2" w:space="0" w:color="000000"/>
+            </w:tcBorders>
+            <w:tcMar>
+              <w:bottom w:w="75" w:type="dxa"/>
+              <w:right w:w="135" w:type="dxa"/>
+            </w:tcMar>
+            <w:vAlign w:val="center"/>
+          </w:tcPr>
+          <w:p>
+            <w:pPr>
+              <w:pStyle w:val="TableContents"/>
+              <w:spacing w:before="0" w:after="0"/>
+              <w:jc w:val="left"/>
+              <w:rPr/>
+            </w:pPr>
+            <w:r>
+              <w:rPr/>
+              <w:t>Unlabeled images</w:t>
+            </w:r>
+          </w:p>
+        </w:tc>
+        <w:tc>
+          <w:tcPr>
+            <w:tcW w:w="1464" w:type="dxa"/>
+            <w:tcBorders>
+              <w:bottom w:val="single" w:sz="2" w:space="0" w:color="000000"/>
+            </w:tcBorders>
+            <w:tcMar>
+              <w:bottom w:w="75" w:type="dxa"/>
+            </w:tcMar>
+            <w:vAlign w:val="center"/>
+          </w:tcPr>
+          <w:p>
+            <w:pPr>
+              <w:pStyle w:val="TableContents"/>
+              <w:spacing w:before="0" w:after="0"/>
+              <w:jc w:val="left"/>
+              <w:rPr/>
+            </w:pPr>
+            <w:r>
+              <w:rPr/>
+              <w:t>45,000</w:t>
+            </w:r>
+          </w:p>
+        </w:tc>
+      </w:tr>
+      <w:tr>
+        <w:trPr/>
+        <w:tc>
+          <w:tcPr>
+            <w:tcW w:w="1901" w:type="dxa"/>
+            <w:tcBorders>
+              <w:bottom w:val="single" w:sz="2" w:space="0" w:color="000000"/>
+              <w:right w:val="single" w:sz="2" w:space="0" w:color="000000"/>
+            </w:tcBorders>
+            <w:tcMar>
+              <w:bottom w:w="75" w:type="dxa"/>
+              <w:right w:w="135" w:type="dxa"/>
+            </w:tcMar>
+            <w:vAlign w:val="center"/>
+          </w:tcPr>
+          <w:p>
+            <w:pPr>
+              <w:pStyle w:val="TableContents"/>
+              <w:spacing w:before="0" w:after="0"/>
+              <w:jc w:val="left"/>
+              <w:rPr/>
+            </w:pPr>
+            <w:r>
+              <w:rPr/>
+              <w:t>Batches/epoch</w:t>
+            </w:r>
+          </w:p>
+        </w:tc>
+        <w:tc>
+          <w:tcPr>
+            <w:tcW w:w="1464" w:type="dxa"/>
+            <w:tcBorders>
+              <w:bottom w:val="single" w:sz="2" w:space="0" w:color="000000"/>
+            </w:tcBorders>
+            <w:tcMar>
+              <w:bottom w:w="75" w:type="dxa"/>
+            </w:tcMar>
+            <w:vAlign w:val="center"/>
+          </w:tcPr>
+          <w:p>
+            <w:pPr>
+              <w:pStyle w:val="TableContents"/>
+              <w:spacing w:before="0" w:after="0"/>
+              <w:jc w:val="left"/>
+              <w:rPr/>
+            </w:pPr>
+            <w:r>
+              <w:rPr/>
+              <w:t>703</w:t>
+            </w:r>
+          </w:p>
+        </w:tc>
+      </w:tr>
+      <w:tr>
+        <w:trPr/>
+        <w:tc>
+          <w:tcPr>
+            <w:tcW w:w="1901" w:type="dxa"/>
+            <w:tcBorders>
+              <w:bottom w:val="single" w:sz="2" w:space="0" w:color="000000"/>
+              <w:right w:val="single" w:sz="2" w:space="0" w:color="000000"/>
+            </w:tcBorders>
+            <w:tcMar>
+              <w:bottom w:w="75" w:type="dxa"/>
+              <w:right w:w="135" w:type="dxa"/>
+            </w:tcMar>
+            <w:vAlign w:val="center"/>
+          </w:tcPr>
+          <w:p>
+            <w:pPr>
+              <w:pStyle w:val="TableContents"/>
+              <w:spacing w:before="0" w:after="0"/>
+              <w:jc w:val="left"/>
+              <w:rPr/>
+            </w:pPr>
+            <w:r>
+              <w:rPr/>
+              <w:t>Initial loss</w:t>
+            </w:r>
+          </w:p>
+        </w:tc>
+        <w:tc>
+          <w:tcPr>
+            <w:tcW w:w="1464" w:type="dxa"/>
+            <w:tcBorders>
+              <w:bottom w:val="single" w:sz="2" w:space="0" w:color="000000"/>
+            </w:tcBorders>
+            <w:tcMar>
+              <w:bottom w:w="75" w:type="dxa"/>
+            </w:tcMar>
+            <w:vAlign w:val="center"/>
+          </w:tcPr>
+          <w:p>
+            <w:pPr>
+              <w:pStyle w:val="TableContents"/>
+              <w:spacing w:before="0" w:after="0"/>
+              <w:jc w:val="left"/>
+              <w:rPr/>
+            </w:pPr>
+            <w:r>
+              <w:rPr/>
+              <w:t>7.6607</w:t>
+            </w:r>
+          </w:p>
+        </w:tc>
+      </w:tr>
+      <w:tr>
+        <w:trPr/>
+        <w:tc>
+          <w:tcPr>
+            <w:tcW w:w="1901" w:type="dxa"/>
+            <w:tcBorders>
+              <w:bottom w:val="single" w:sz="2" w:space="0" w:color="000000"/>
+              <w:right w:val="single" w:sz="2" w:space="0" w:color="000000"/>
+            </w:tcBorders>
+            <w:tcMar>
+              <w:bottom w:w="75" w:type="dxa"/>
+              <w:right w:w="135" w:type="dxa"/>
+            </w:tcMar>
+            <w:vAlign w:val="center"/>
+          </w:tcPr>
+          <w:p>
+            <w:pPr>
+              <w:pStyle w:val="TableContents"/>
+              <w:spacing w:before="0" w:after="0"/>
+              <w:jc w:val="left"/>
+              <w:rPr/>
+            </w:pPr>
+            <w:r>
+              <w:rPr/>
+              <w:t>Final loss</w:t>
+            </w:r>
+          </w:p>
+        </w:tc>
+        <w:tc>
+          <w:tcPr>
+            <w:tcW w:w="1464" w:type="dxa"/>
+            <w:tcBorders>
+              <w:bottom w:val="single" w:sz="2" w:space="0" w:color="000000"/>
+            </w:tcBorders>
+            <w:tcMar>
+              <w:bottom w:w="75" w:type="dxa"/>
+            </w:tcMar>
+            <w:vAlign w:val="center"/>
+          </w:tcPr>
+          <w:p>
+            <w:pPr>
+              <w:pStyle w:val="TableContents"/>
+              <w:spacing w:before="0" w:after="0"/>
+              <w:jc w:val="left"/>
+              <w:rPr/>
+            </w:pPr>
+            <w:r>
+              <w:rPr/>
+              <w:t>6.4144</w:t>
+            </w:r>
+          </w:p>
+        </w:tc>
+      </w:tr>
+      <w:tr>
+        <w:trPr/>
+        <w:tc>
+          <w:tcPr>
+            <w:tcW w:w="1901" w:type="dxa"/>
+            <w:tcBorders>
+              <w:right w:val="single" w:sz="2" w:space="0" w:color="000000"/>
+            </w:tcBorders>
+            <w:tcMar>
+              <w:right w:w="135" w:type="dxa"/>
+            </w:tcMar>
+            <w:vAlign w:val="center"/>
+          </w:tcPr>
+          <w:p>
+            <w:pPr>
+              <w:pStyle w:val="TableContents"/>
+              <w:spacing w:before="0" w:after="0"/>
+              <w:jc w:val="left"/>
+              <w:rPr/>
+            </w:pPr>
+            <w:r>
+              <w:rPr/>
+              <w:t>Training time</w:t>
+            </w:r>
+          </w:p>
+        </w:tc>
+        <w:tc>
+          <w:tcPr>
+            <w:tcW w:w="1464" w:type="dxa"/>
+            <w:tcBorders/>
+            <w:vAlign w:val="center"/>
+          </w:tcPr>
+          <w:p>
+            <w:pPr>
+              <w:pStyle w:val="TableContents"/>
+              <w:spacing w:before="0" w:after="0"/>
+              <w:jc w:val="left"/>
+              <w:rPr/>
+            </w:pPr>
+            <w:r>
+              <w:rPr/>
+              <w:t>186.5 minute</w:t>
+            </w:r>
+          </w:p>
+        </w:tc>
+      </w:tr>
+    </w:tbl>
+    <w:p>
+      <w:pPr>
+        <w:pStyle w:val="Normal"/>
+        <w:rPr/>
+      </w:pPr>
+      <w:r>
+        <w:rPr/>
+      </w:r>
+    </w:p>
+    <w:p>
+      <w:pPr>
+        <w:pStyle w:val="TextBody"/>
+        <w:rPr/>
+      </w:pPr>
+      <w:r>
+        <w:rPr/>
+        <w:t>Before / after similarity table:</w:t>
+      </w:r>
+    </w:p>
+    <w:tbl>
+      <w:tblPr>
+        <w:tblW w:w="5583" w:type="dxa"/>
+        <w:jc w:val="left"/>
+        <w:tblInd w:w="0" w:type="dxa"/>
+        <w:tblLayout w:type="fixed"/>
+        <w:tblCellMar>
+          <w:top w:w="0" w:type="dxa"/>
+          <w:left w:w="0" w:type="dxa"/>
+          <w:bottom w:w="0" w:type="dxa"/>
+          <w:right w:w="0" w:type="dxa"/>
+        </w:tblCellMar>
+      </w:tblPr>
+      <w:tblGrid>
+        <w:gridCol w:w="771"/>
+        <w:gridCol w:w="2646"/>
+        <w:gridCol w:w="2166"/>
+      </w:tblGrid>
+      <w:tr>
+        <w:trPr>
+          <w:tblHeader w:val="true"/>
+        </w:trPr>
+        <w:tc>
+          <w:tcPr>
+            <w:tcW w:w="771" w:type="dxa"/>
+            <w:tcBorders/>
+            <w:vAlign w:val="center"/>
+          </w:tcPr>
+          <w:p>
+            <w:pPr>
+              <w:pStyle w:val="TableHeading"/>
+              <w:spacing w:before="0" w:after="200"/>
+              <w:rPr>
+                <w:sz w:val="4"/>
+                <w:szCs w:val="4"/>
+              </w:rPr>
+            </w:pPr>
+            <w:r>
+              <w:rPr>
+                <w:sz w:val="4"/>
+                <w:szCs w:val="4"/>
+              </w:rPr>
+            </w:r>
+          </w:p>
+        </w:tc>
+        <w:tc>
+          <w:tcPr>
+            <w:tcW w:w="2646" w:type="dxa"/>
+            <w:tcBorders/>
+            <w:vAlign w:val="center"/>
+          </w:tcPr>
+          <w:p>
+            <w:pPr>
+              <w:pStyle w:val="TableHeading"/>
+              <w:spacing w:lineRule="auto" w:line="340" w:before="0" w:after="200"/>
+              <w:jc w:val="left"/>
+              <w:rPr>
+                <w:sz w:val="21"/>
+              </w:rPr>
+            </w:pPr>
+            <w:r>
+              <w:rPr>
+                <w:sz w:val="21"/>
+              </w:rPr>
+              <w:t>Same-image views</w:t>
+            </w:r>
+          </w:p>
+        </w:tc>
+        <w:tc>
+          <w:tcPr>
+            <w:tcW w:w="2166" w:type="dxa"/>
+            <w:tcBorders/>
+            <w:vAlign w:val="center"/>
+          </w:tcPr>
+          <w:p>
+            <w:pPr>
+              <w:pStyle w:val="TableHeading"/>
+              <w:spacing w:lineRule="auto" w:line="340" w:before="0" w:after="200"/>
+              <w:jc w:val="left"/>
+              <w:rPr>
+                <w:sz w:val="21"/>
+              </w:rPr>
+            </w:pPr>
+            <w:r>
+              <w:rPr>
+                <w:sz w:val="21"/>
+              </w:rPr>
+              <w:t>Different images</w:t>
+            </w:r>
+          </w:p>
+        </w:tc>
+      </w:tr>
+      <w:tr>
+        <w:trPr/>
+        <w:tc>
+          <w:tcPr>
+            <w:tcW w:w="771" w:type="dxa"/>
+            <w:tcBorders>
+              <w:bottom w:val="single" w:sz="2" w:space="0" w:color="000000"/>
+              <w:right w:val="single" w:sz="2" w:space="0" w:color="000000"/>
+            </w:tcBorders>
+            <w:tcMar>
+              <w:bottom w:w="75" w:type="dxa"/>
+              <w:right w:w="135" w:type="dxa"/>
+            </w:tcMar>
+            <w:vAlign w:val="center"/>
+          </w:tcPr>
+          <w:p>
+            <w:pPr>
+              <w:pStyle w:val="TableContents"/>
+              <w:spacing w:before="0" w:after="0"/>
+              <w:jc w:val="left"/>
+              <w:rPr/>
+            </w:pPr>
+            <w:r>
+              <w:rPr/>
+              <w:t>Before</w:t>
+            </w:r>
+          </w:p>
+        </w:tc>
+        <w:tc>
+          <w:tcPr>
+            <w:tcW w:w="2646" w:type="dxa"/>
+            <w:tcBorders>
+              <w:bottom w:val="single" w:sz="2" w:space="0" w:color="000000"/>
+              <w:right w:val="single" w:sz="2" w:space="0" w:color="000000"/>
+            </w:tcBorders>
+            <w:tcMar>
+              <w:bottom w:w="75" w:type="dxa"/>
+              <w:right w:w="135" w:type="dxa"/>
+            </w:tcMar>
+            <w:vAlign w:val="center"/>
+          </w:tcPr>
+          <w:p>
+            <w:pPr>
+              <w:pStyle w:val="TableContents"/>
+              <w:spacing w:before="0" w:after="0"/>
+              <w:jc w:val="left"/>
+              <w:rPr/>
+            </w:pPr>
+            <w:r>
+              <w:rPr/>
+              <w:t>0.989</w:t>
+            </w:r>
+          </w:p>
+        </w:tc>
+        <w:tc>
+          <w:tcPr>
+            <w:tcW w:w="2166" w:type="dxa"/>
+            <w:tcBorders>
+              <w:bottom w:val="single" w:sz="2" w:space="0" w:color="000000"/>
+            </w:tcBorders>
+            <w:tcMar>
+              <w:bottom w:w="75" w:type="dxa"/>
+            </w:tcMar>
+            <w:vAlign w:val="center"/>
+          </w:tcPr>
+          <w:p>
+            <w:pPr>
+              <w:pStyle w:val="TableContents"/>
+              <w:spacing w:before="0" w:after="0"/>
+              <w:jc w:val="left"/>
+              <w:rPr/>
+            </w:pPr>
+            <w:r>
+              <w:rPr/>
+              <w:t>0.985</w:t>
+            </w:r>
+          </w:p>
+        </w:tc>
+      </w:tr>
+      <w:tr>
+        <w:trPr/>
+        <w:tc>
+          <w:tcPr>
+            <w:tcW w:w="771" w:type="dxa"/>
+            <w:tcBorders>
+              <w:right w:val="single" w:sz="2" w:space="0" w:color="000000"/>
+            </w:tcBorders>
+            <w:tcMar>
+              <w:right w:w="135" w:type="dxa"/>
+            </w:tcMar>
+            <w:vAlign w:val="center"/>
+          </w:tcPr>
+          <w:p>
+            <w:pPr>
+              <w:pStyle w:val="TableContents"/>
+              <w:spacing w:before="0" w:after="0"/>
+              <w:jc w:val="left"/>
+              <w:rPr/>
+            </w:pPr>
+            <w:r>
+              <w:rPr/>
+              <w:t>After</w:t>
+            </w:r>
+          </w:p>
+        </w:tc>
+        <w:tc>
+          <w:tcPr>
+            <w:tcW w:w="2646" w:type="dxa"/>
+            <w:tcBorders>
+              <w:right w:val="single" w:sz="2" w:space="0" w:color="000000"/>
+            </w:tcBorders>
+            <w:tcMar>
+              <w:right w:w="135" w:type="dxa"/>
+            </w:tcMar>
+            <w:vAlign w:val="center"/>
+          </w:tcPr>
+          <w:p>
+            <w:pPr>
+              <w:pStyle w:val="TableContents"/>
+              <w:spacing w:before="0" w:after="0"/>
+              <w:jc w:val="left"/>
+              <w:rPr/>
+            </w:pPr>
+            <w:r>
+              <w:rPr/>
+              <w:t>0.904</w:t>
+            </w:r>
+          </w:p>
+        </w:tc>
+        <w:tc>
+          <w:tcPr>
+            <w:tcW w:w="2166" w:type="dxa"/>
+            <w:tcBorders/>
+            <w:vAlign w:val="center"/>
+          </w:tcPr>
+          <w:p>
+            <w:pPr>
+              <w:pStyle w:val="TableContents"/>
+              <w:spacing w:before="0" w:after="0"/>
+              <w:jc w:val="left"/>
+              <w:rPr/>
+            </w:pPr>
+            <w:r>
+              <w:rPr/>
+              <w:t>0.008</w:t>
+            </w:r>
+          </w:p>
+        </w:tc>
+      </w:tr>
+    </w:tbl>
+    <w:p>
+      <w:pPr>
+        <w:pStyle w:val="Normal"/>
+        <w:rPr/>
+      </w:pPr>
+      <w:r>
+        <w:rPr/>
+      </w:r>
+    </w:p>
+    <w:p>
+      <w:pPr>
+        <w:pStyle w:val="Normal"/>
+        <w:widowControl/>
+        <w:ind w:left="0" w:right="0" w:hanging="0"/>
+        <w:rPr>
+          <w:rFonts w:ascii="system-ui;Ubuntu;Droid Sans;sans-serif" w:hAnsi="system-ui;Ubuntu;Droid Sans;sans-serif"/>
+          <w:b w:val="false"/>
+          <w:i w:val="false"/>
+          <w:caps w:val="false"/>
+          <w:smallCaps w:val="false"/>
+          <w:spacing w:val="0"/>
+          <w:sz w:val="20"/>
+        </w:rPr>
+      </w:pPr>
+      <w:r>
+        <w:rPr>
+          <w:rFonts w:ascii="system-ui;Ubuntu;Droid Sans;sans-serif" w:hAnsi="system-ui;Ubuntu;Droid Sans;sans-serif"/>
+          <w:b w:val="false"/>
+          <w:i w:val="false"/>
+          <w:caps w:val="false"/>
+          <w:smallCaps w:val="false"/>
+          <w:spacing w:val="0"/>
+          <w:sz w:val="20"/>
+        </w:rPr>
+        <w:t>After SimCLR, same-image views stay highly similar; different images are pushed apart (near 0) — contrastive learning worked.</w:t>
+      </w:r>
+    </w:p>
+    <w:p>
+      <w:pPr>
+        <w:pStyle w:val="Normal"/>
+        <w:widowControl/>
+        <w:ind w:left="0" w:right="0" w:hanging="0"/>
+        <w:rPr>
+          <w:rFonts w:ascii="system-ui;Ubuntu;Droid Sans;sans-serif" w:hAnsi="system-ui;Ubuntu;Droid Sans;sans-serif"/>
+          <w:b w:val="false"/>
+          <w:i w:val="false"/>
+          <w:caps w:val="false"/>
+          <w:smallCaps w:val="false"/>
+          <w:spacing w:val="0"/>
+          <w:sz w:val="20"/>
+        </w:rPr>
+      </w:pPr>
+      <w:r>
+        <w:rPr>
+          <w:rFonts w:ascii="system-ui;Ubuntu;Droid Sans;sans-serif" w:hAnsi="system-ui;Ubuntu;Droid Sans;sans-serif"/>
+          <w:b w:val="false"/>
+          <w:i w:val="false"/>
+          <w:caps w:val="false"/>
+          <w:smallCaps w:val="false"/>
+          <w:spacing w:val="0"/>
+          <w:sz w:val="20"/>
+        </w:rPr>
+      </w:r>
+    </w:p>
+    <w:p>
+      <w:pPr>
+        <w:pStyle w:val="Normal"/>
+        <w:widowControl/>
+        <w:ind w:left="0" w:right="0" w:hanging="0"/>
+        <w:rPr>
+          <w:rFonts w:ascii="system-ui;Ubuntu;Droid Sans;sans-serif" w:hAnsi="system-ui;Ubuntu;Droid Sans;sans-serif"/>
+          <w:b w:val="false"/>
+          <w:i w:val="false"/>
+          <w:caps w:val="false"/>
+          <w:smallCaps w:val="false"/>
+          <w:spacing w:val="0"/>
+          <w:sz w:val="20"/>
+        </w:rPr>
+      </w:pPr>
+      <w:r>
+        <w:rPr>
+          <w:rFonts w:ascii="system-ui;Ubuntu;Droid Sans;sans-serif" w:hAnsi="system-ui;Ubuntu;Droid Sans;sans-serif"/>
+          <w:b w:val="false"/>
+          <w:i w:val="false"/>
+          <w:caps w:val="false"/>
+          <w:smallCaps w:val="false"/>
+          <w:spacing w:val="0"/>
+          <w:sz w:val="20"/>
+        </w:rPr>
+      </w:r>
+    </w:p>
+    <w:p>
+      <w:pPr>
+        <w:pStyle w:val="Normal"/>
+        <w:widowControl/>
+        <w:ind w:left="0" w:right="0" w:hanging="0"/>
+        <w:rPr>
+          <w:rFonts w:ascii="system-ui;Ubuntu;Droid Sans;sans-serif" w:hAnsi="system-ui;Ubuntu;Droid Sans;sans-serif"/>
+          <w:b w:val="false"/>
+          <w:i w:val="false"/>
+          <w:caps w:val="false"/>
+          <w:smallCaps w:val="false"/>
+          <w:spacing w:val="0"/>
+          <w:sz w:val="20"/>
+        </w:rPr>
+      </w:pPr>
+      <w:r>
+        <w:rPr>
+          <w:rFonts w:ascii="system-ui;Ubuntu;Droid Sans;sans-serif" w:hAnsi="system-ui;Ubuntu;Droid Sans;sans-serif"/>
+          <w:b w:val="false"/>
+          <w:i w:val="false"/>
+          <w:caps w:val="false"/>
+          <w:smallCaps w:val="false"/>
+          <w:spacing w:val="0"/>
+          <w:sz w:val="20"/>
+        </w:rPr>
+        <w:drawing>
+          <wp:anchor behindDoc="0" distT="0" distB="0" distL="0" distR="0" simplePos="0" locked="0" layoutInCell="0" allowOverlap="1" relativeHeight="7">
+            <wp:simplePos x="0" y="0"/>
+            <wp:positionH relativeFrom="column">
+              <wp:posOffset>0</wp:posOffset>
+            </wp:positionH>
+            <wp:positionV relativeFrom="paragraph">
+              <wp:posOffset>-64770</wp:posOffset>
+            </wp:positionV>
+            <wp:extent cx="6400800" cy="4632325"/>
+            <wp:effectExtent l="0" t="0" r="0" b="0"/>
+            <wp:wrapSquare wrapText="largest"/>
+            <wp:docPr id="6" name="Image6" descr=""/>
+            <wp:cNvGraphicFramePr>
+              <a:graphicFrameLocks xmlns:a="http://schemas.openxmlformats.org/drawingml/2006/main" noChangeAspect="1"/>
+            </wp:cNvGraphicFramePr>
+            <a:graphic xmlns:a="http://schemas.openxmlformats.org/drawingml/2006/main">
+              <a:graphicData uri="http://schemas.openxmlformats.org/drawingml/2006/picture">
+                <pic:pic xmlns:pic="http://schemas.openxmlformats.org/drawingml/2006/picture">
+                  <pic:nvPicPr>
+                    <pic:cNvPr id="6" name="Image6" descr=""/>
+                    <pic:cNvPicPr>
+                      <a:picLocks noChangeAspect="1" noChangeArrowheads="1"/>
+                    </pic:cNvPicPr>
+                  </pic:nvPicPr>
+                  <pic:blipFill>
+                    <a:blip r:embed="rId7"/>
+                    <a:stretch>
+                      <a:fillRect/>
+                    </a:stretch>
+                  </pic:blipFill>
+                  <pic:spPr bwMode="auto">
+                    <a:xfrm>
+                      <a:off x="0" y="0"/>
+                      <a:ext cx="6400800" cy="4632325"/>
+                    </a:xfrm>
+                    <a:prstGeom prst="rect">
+                      <a:avLst/>
+                    </a:prstGeom>
+                  </pic:spPr>
+                </pic:pic>
+              </a:graphicData>
+            </a:graphic>
+          </wp:anchor>
+        </w:drawing>
+      </w:r>
+    </w:p>
+    <w:p>
+      <w:pPr>
+        <w:pStyle w:val="Normal"/>
+        <w:widowControl/>
+        <w:ind w:left="0" w:right="0" w:hanging="0"/>
+        <w:rPr>
+          <w:rFonts w:ascii="system-ui;Ubuntu;Droid Sans;sans-serif" w:hAnsi="system-ui;Ubuntu;Droid Sans;sans-serif"/>
+          <w:b w:val="false"/>
+          <w:i w:val="false"/>
+          <w:caps w:val="false"/>
+          <w:smallCaps w:val="false"/>
+          <w:spacing w:val="0"/>
+          <w:sz w:val="20"/>
+        </w:rPr>
+      </w:pPr>
+      <w:r>
+        <w:rPr>
+          <w:rFonts w:ascii="system-ui;Ubuntu;Droid Sans;sans-serif" w:hAnsi="system-ui;Ubuntu;Droid Sans;sans-serif"/>
+          <w:b w:val="false"/>
+          <w:i w:val="false"/>
+          <w:caps w:val="false"/>
+          <w:smallCaps w:val="false"/>
+          <w:spacing w:val="0"/>
+          <w:sz w:val="20"/>
+        </w:rPr>
+        <w:drawing>
+          <wp:anchor behindDoc="0" distT="0" distB="0" distL="0" distR="0" simplePos="0" locked="0" layoutInCell="0" allowOverlap="1" relativeHeight="8">
+            <wp:simplePos x="0" y="0"/>
+            <wp:positionH relativeFrom="column">
+              <wp:align>center</wp:align>
+            </wp:positionH>
+            <wp:positionV relativeFrom="paragraph">
+              <wp:posOffset>635</wp:posOffset>
+            </wp:positionV>
+            <wp:extent cx="6400800" cy="6532245"/>
+            <wp:effectExtent l="0" t="0" r="0" b="0"/>
+            <wp:wrapSquare wrapText="largest"/>
+            <wp:docPr id="7" name="Image7" descr=""/>
+            <wp:cNvGraphicFramePr>
+              <a:graphicFrameLocks xmlns:a="http://schemas.openxmlformats.org/drawingml/2006/main" noChangeAspect="1"/>
+            </wp:cNvGraphicFramePr>
+            <a:graphic xmlns:a="http://schemas.openxmlformats.org/drawingml/2006/main">
+              <a:graphicData uri="http://schemas.openxmlformats.org/drawingml/2006/picture">
+                <pic:pic xmlns:pic="http://schemas.openxmlformats.org/drawingml/2006/picture">
+                  <pic:nvPicPr>
+                    <pic:cNvPr id="7" name="Image7" descr=""/>
+                    <pic:cNvPicPr>
+                      <a:picLocks noChangeAspect="1" noChangeArrowheads="1"/>
+                    </pic:cNvPicPr>
+                  </pic:nvPicPr>
+                  <pic:blipFill>
+                    <a:blip r:embed="rId8"/>
+                    <a:stretch>
+                      <a:fillRect/>
+                    </a:stretch>
+                  </pic:blipFill>
+                  <pic:spPr bwMode="auto">
+                    <a:xfrm>
+                      <a:off x="0" y="0"/>
+                      <a:ext cx="6400800" cy="6532245"/>
+                    </a:xfrm>
+                    <a:prstGeom prst="rect">
+                      <a:avLst/>
+                    </a:prstGeom>
+                  </pic:spPr>
+                </pic:pic>
+              </a:graphicData>
+            </a:graphic>
+          </wp:anchor>
+        </w:drawing>
+      </w:r>
+    </w:p>
+    <w:p>
+      <w:pPr>
+        <w:pStyle w:val="Normal"/>
+        <w:widowControl/>
+        <w:ind w:left="0" w:right="0" w:hanging="0"/>
+        <w:rPr>
+          <w:rFonts w:ascii="system-ui;Ubuntu;Droid Sans;sans-serif" w:hAnsi="system-ui;Ubuntu;Droid Sans;sans-serif"/>
+          <w:b w:val="false"/>
+          <w:i w:val="false"/>
+          <w:caps w:val="false"/>
+          <w:smallCaps w:val="false"/>
+          <w:spacing w:val="0"/>
+          <w:sz w:val="20"/>
+        </w:rPr>
+      </w:pPr>
+      <w:r>
+        <w:rPr>
+          <w:rFonts w:ascii="system-ui;Ubuntu;Droid Sans;sans-serif" w:hAnsi="system-ui;Ubuntu;Droid Sans;sans-serif"/>
+          <w:b w:val="false"/>
+          <w:i w:val="false"/>
+          <w:caps w:val="false"/>
+          <w:smallCaps w:val="false"/>
+          <w:spacing w:val="0"/>
+          <w:sz w:val="20"/>
+        </w:rPr>
+      </w:r>
+    </w:p>
+    <w:p>
+      <w:pPr>
         <w:pStyle w:val="Heading1"/>
         <w:rPr/>
       </w:pPr>
@@ -1946,6 +3415,192 @@
       <w:r>
         <w:rPr/>
         <w:t>Compare random frozen encoder with SimCLR frozen encoder.</w:t>
+      </w:r>
+    </w:p>
+    <w:p>
+      <w:pPr>
+        <w:pStyle w:val="Normal"/>
+        <w:rPr/>
+      </w:pPr>
+      <w:r>
+        <w:rPr/>
+      </w:r>
+    </w:p>
+    <w:tbl>
+      <w:tblPr>
+        <w:tblW w:w="4795" w:type="dxa"/>
+        <w:jc w:val="left"/>
+        <w:tblInd w:w="0" w:type="dxa"/>
+        <w:tblLayout w:type="fixed"/>
+        <w:tblCellMar>
+          <w:top w:w="0" w:type="dxa"/>
+          <w:left w:w="0" w:type="dxa"/>
+          <w:bottom w:w="0" w:type="dxa"/>
+          <w:right w:w="0" w:type="dxa"/>
+        </w:tblCellMar>
+      </w:tblPr>
+      <w:tblGrid>
+        <w:gridCol w:w="3021"/>
+        <w:gridCol w:w="1774"/>
+      </w:tblGrid>
+      <w:tr>
+        <w:trPr>
+          <w:tblHeader w:val="true"/>
+        </w:trPr>
+        <w:tc>
+          <w:tcPr>
+            <w:tcW w:w="3021" w:type="dxa"/>
+            <w:tcBorders/>
+            <w:vAlign w:val="center"/>
+          </w:tcPr>
+          <w:p>
+            <w:pPr>
+              <w:pStyle w:val="TableHeading"/>
+              <w:spacing w:lineRule="auto" w:line="340" w:before="0" w:after="200"/>
+              <w:jc w:val="left"/>
+              <w:rPr>
+                <w:sz w:val="21"/>
+              </w:rPr>
+            </w:pPr>
+            <w:r>
+              <w:rPr>
+                <w:sz w:val="21"/>
+              </w:rPr>
+              <w:t>Encoder</w:t>
+            </w:r>
+          </w:p>
+        </w:tc>
+        <w:tc>
+          <w:tcPr>
+            <w:tcW w:w="1774" w:type="dxa"/>
+            <w:tcBorders/>
+            <w:vAlign w:val="center"/>
+          </w:tcPr>
+          <w:p>
+            <w:pPr>
+              <w:pStyle w:val="TableHeading"/>
+              <w:spacing w:lineRule="auto" w:line="340" w:before="0" w:after="200"/>
+              <w:jc w:val="left"/>
+              <w:rPr>
+                <w:sz w:val="21"/>
+              </w:rPr>
+            </w:pPr>
+            <w:r>
+              <w:rPr>
+                <w:sz w:val="21"/>
+              </w:rPr>
+              <w:t>Test accuracy</w:t>
+            </w:r>
+          </w:p>
+        </w:tc>
+      </w:tr>
+      <w:tr>
+        <w:trPr/>
+        <w:tc>
+          <w:tcPr>
+            <w:tcW w:w="3021" w:type="dxa"/>
+            <w:tcBorders>
+              <w:bottom w:val="single" w:sz="2" w:space="0" w:color="000000"/>
+              <w:right w:val="single" w:sz="2" w:space="0" w:color="000000"/>
+            </w:tcBorders>
+            <w:tcMar>
+              <w:bottom w:w="75" w:type="dxa"/>
+              <w:right w:w="135" w:type="dxa"/>
+            </w:tcMar>
+            <w:vAlign w:val="center"/>
+          </w:tcPr>
+          <w:p>
+            <w:pPr>
+              <w:pStyle w:val="TableContents"/>
+              <w:spacing w:before="0" w:after="0"/>
+              <w:jc w:val="left"/>
+              <w:rPr/>
+            </w:pPr>
+            <w:r>
+              <w:rPr/>
+              <w:t>Random frozen + linear head</w:t>
+            </w:r>
+          </w:p>
+        </w:tc>
+        <w:tc>
+          <w:tcPr>
+            <w:tcW w:w="1774" w:type="dxa"/>
+            <w:tcBorders>
+              <w:bottom w:val="single" w:sz="2" w:space="0" w:color="000000"/>
+            </w:tcBorders>
+            <w:tcMar>
+              <w:bottom w:w="75" w:type="dxa"/>
+            </w:tcMar>
+            <w:vAlign w:val="center"/>
+          </w:tcPr>
+          <w:p>
+            <w:pPr>
+              <w:pStyle w:val="TableContents"/>
+              <w:spacing w:before="0" w:after="0"/>
+              <w:jc w:val="left"/>
+              <w:rPr/>
+            </w:pPr>
+            <w:r>
+              <w:rPr/>
+              <w:t>27.25%</w:t>
+            </w:r>
+          </w:p>
+        </w:tc>
+      </w:tr>
+      <w:tr>
+        <w:trPr/>
+        <w:tc>
+          <w:tcPr>
+            <w:tcW w:w="3021" w:type="dxa"/>
+            <w:tcBorders>
+              <w:right w:val="single" w:sz="2" w:space="0" w:color="000000"/>
+            </w:tcBorders>
+            <w:tcMar>
+              <w:right w:w="135" w:type="dxa"/>
+            </w:tcMar>
+            <w:vAlign w:val="center"/>
+          </w:tcPr>
+          <w:p>
+            <w:pPr>
+              <w:pStyle w:val="TableContents"/>
+              <w:spacing w:before="0" w:after="0"/>
+              <w:jc w:val="left"/>
+              <w:rPr/>
+            </w:pPr>
+            <w:r>
+              <w:rPr/>
+              <w:t>SimCLR frozen + linear head</w:t>
+            </w:r>
+          </w:p>
+        </w:tc>
+        <w:tc>
+          <w:tcPr>
+            <w:tcW w:w="1774" w:type="dxa"/>
+            <w:tcBorders/>
+            <w:vAlign w:val="center"/>
+          </w:tcPr>
+          <w:p>
+            <w:pPr>
+              <w:pStyle w:val="TableContents"/>
+              <w:spacing w:before="0" w:after="0"/>
+              <w:jc w:val="left"/>
+              <w:rPr/>
+            </w:pPr>
+            <w:r>
+              <w:rPr/>
+              <w:t>74.76%</w:t>
+            </w:r>
+          </w:p>
+        </w:tc>
+      </w:tr>
+    </w:tbl>
+    <w:p>
+      <w:pPr>
+        <w:pStyle w:val="Normal"/>
+        <w:rPr/>
+      </w:pPr>
+      <w:r>
+        <w:rPr/>
       </w:r>
     </w:p>
     <w:p>
@@ -2115,11 +3770,18 @@
             </w:pPr>
             <w:r>
               <w:rPr>
-                <w:rFonts w:eastAsia="ＭＳ 明朝" w:cs=""/>
+                <w:rFonts w:eastAsia="ＭＳ 明朝" w:cs="" w:ascii="system-ui;Ubuntu;Droid Sans;sans-serif" w:hAnsi="system-ui;Ubuntu;Droid Sans;sans-serif"/>
+                <w:b/>
+                <w:i w:val="false"/>
+                <w:caps w:val="false"/>
+                <w:smallCaps w:val="false"/>
+                <w:spacing w:val="0"/>
                 <w:kern w:val="0"/>
+                <w:sz w:val="20"/>
                 <w:szCs w:val="22"/>
                 <w:lang w:val="en-US" w:eastAsia="en-US" w:bidi="ar-SA"/>
               </w:rPr>
+              <w:t>69.56%</w:t>
             </w:r>
           </w:p>
         </w:tc>
@@ -2186,6 +3848,7 @@
                 <w:szCs w:val="22"/>
                 <w:lang w:val="en-US" w:eastAsia="en-US" w:bidi="ar-SA"/>
               </w:rPr>
+              <w:t>23.28%</w:t>
             </w:r>
           </w:p>
         </w:tc>
@@ -2247,11 +3910,18 @@
             </w:pPr>
             <w:r>
               <w:rPr>
-                <w:rFonts w:eastAsia="ＭＳ 明朝" w:cs=""/>
+                <w:rFonts w:eastAsia="ＭＳ 明朝" w:cs="" w:ascii="system-ui;Ubuntu;Droid Sans;sans-serif" w:hAnsi="system-ui;Ubuntu;Droid Sans;sans-serif"/>
+                <w:b/>
+                <w:i w:val="false"/>
+                <w:caps w:val="false"/>
+                <w:smallCaps w:val="false"/>
+                <w:spacing w:val="0"/>
                 <w:kern w:val="0"/>
+                <w:sz w:val="20"/>
                 <w:szCs w:val="22"/>
                 <w:lang w:val="en-US" w:eastAsia="en-US" w:bidi="ar-SA"/>
               </w:rPr>
+              <w:t>73.17%</w:t>
             </w:r>
           </w:p>
         </w:tc>
@@ -2313,11 +3983,18 @@
             </w:pPr>
             <w:r>
               <w:rPr>
-                <w:rFonts w:eastAsia="ＭＳ 明朝" w:cs=""/>
+                <w:rFonts w:eastAsia="ＭＳ 明朝" w:cs="" w:ascii="system-ui;Ubuntu;Droid Sans;sans-serif" w:hAnsi="system-ui;Ubuntu;Droid Sans;sans-serif"/>
+                <w:b/>
+                <w:i w:val="false"/>
+                <w:caps w:val="false"/>
+                <w:smallCaps w:val="false"/>
+                <w:spacing w:val="0"/>
                 <w:kern w:val="0"/>
+                <w:sz w:val="20"/>
                 <w:szCs w:val="22"/>
                 <w:lang w:val="en-US" w:eastAsia="en-US" w:bidi="ar-SA"/>
               </w:rPr>
+              <w:t>81.67%</w:t>
             </w:r>
           </w:p>
         </w:tc>
@@ -2334,6 +4011,131 @@
     </w:p>
     <w:p>
       <w:pPr>
+        <w:pStyle w:val="Normal"/>
+        <w:rPr/>
+      </w:pPr>
+      <w:r>
+        <w:rPr/>
+        <w:drawing>
+          <wp:anchor behindDoc="0" distT="0" distB="0" distL="0" distR="0" simplePos="0" locked="0" layoutInCell="0" allowOverlap="1" relativeHeight="9">
+            <wp:simplePos x="0" y="0"/>
+            <wp:positionH relativeFrom="column">
+              <wp:align>center</wp:align>
+            </wp:positionH>
+            <wp:positionV relativeFrom="paragraph">
+              <wp:posOffset>635</wp:posOffset>
+            </wp:positionV>
+            <wp:extent cx="6400800" cy="3200400"/>
+            <wp:effectExtent l="0" t="0" r="0" b="0"/>
+            <wp:wrapSquare wrapText="largest"/>
+            <wp:docPr id="8" name="Image8" descr=""/>
+            <wp:cNvGraphicFramePr>
+              <a:graphicFrameLocks xmlns:a="http://schemas.openxmlformats.org/drawingml/2006/main" noChangeAspect="1"/>
+            </wp:cNvGraphicFramePr>
+            <a:graphic xmlns:a="http://schemas.openxmlformats.org/drawingml/2006/main">
+              <a:graphicData uri="http://schemas.openxmlformats.org/drawingml/2006/picture">
+                <pic:pic xmlns:pic="http://schemas.openxmlformats.org/drawingml/2006/picture">
+                  <pic:nvPicPr>
+                    <pic:cNvPr id="8" name="Image8" descr=""/>
+                    <pic:cNvPicPr>
+                      <a:picLocks noChangeAspect="1" noChangeArrowheads="1"/>
+                    </pic:cNvPicPr>
+                  </pic:nvPicPr>
+                  <pic:blipFill>
+                    <a:blip r:embed="rId9"/>
+                    <a:stretch>
+                      <a:fillRect/>
+                    </a:stretch>
+                  </pic:blipFill>
+                  <pic:spPr bwMode="auto">
+                    <a:xfrm>
+                      <a:off x="0" y="0"/>
+                      <a:ext cx="6400800" cy="3200400"/>
+                    </a:xfrm>
+                    <a:prstGeom prst="rect">
+                      <a:avLst/>
+                    </a:prstGeom>
+                  </pic:spPr>
+                </pic:pic>
+              </a:graphicData>
+            </a:graphic>
+          </wp:anchor>
+        </w:drawing>
+      </w:r>
+    </w:p>
+    <w:p>
+      <w:pPr>
+        <w:pStyle w:val="TextBody"/>
+        <w:numPr>
+          <w:ilvl w:val="0"/>
+          <w:numId w:val="13"/>
+        </w:numPr>
+        <w:pBdr/>
+        <w:tabs>
+          <w:tab w:val="clear" w:pos="720"/>
+          <w:tab w:val="left" w:pos="0" w:leader="none"/>
+        </w:tabs>
+        <w:spacing w:before="0" w:after="0"/>
+        <w:ind w:left="709" w:hanging="283"/>
+        <w:rPr/>
+      </w:pPr>
+      <w:r>
+        <w:rPr/>
+        <w:t>SimCLR frozen (73.17%) beats supervised scratch (69.56%) with the same 10% labels.</w:t>
+      </w:r>
+    </w:p>
+    <w:p>
+      <w:pPr>
+        <w:pStyle w:val="TextBody"/>
+        <w:numPr>
+          <w:ilvl w:val="0"/>
+          <w:numId w:val="13"/>
+        </w:numPr>
+        <w:pBdr/>
+        <w:tabs>
+          <w:tab w:val="clear" w:pos="720"/>
+          <w:tab w:val="left" w:pos="0" w:leader="none"/>
+        </w:tabs>
+        <w:spacing w:before="0" w:after="0"/>
+        <w:ind w:left="709" w:hanging="283"/>
+        <w:rPr/>
+      </w:pPr>
+      <w:r>
+        <w:rPr/>
+        <w:t>Full fine-tuning (81.67%) is best — pretraining + adaptation beats linear probe alone.</w:t>
+      </w:r>
+    </w:p>
+    <w:p>
+      <w:pPr>
+        <w:pStyle w:val="TextBody"/>
+        <w:numPr>
+          <w:ilvl w:val="0"/>
+          <w:numId w:val="13"/>
+        </w:numPr>
+        <w:pBdr/>
+        <w:tabs>
+          <w:tab w:val="clear" w:pos="720"/>
+          <w:tab w:val="left" w:pos="0" w:leader="none"/>
+        </w:tabs>
+        <w:ind w:left="709" w:hanging="283"/>
+        <w:rPr/>
+      </w:pPr>
+      <w:r>
+        <w:rPr/>
+        <w:t>Random frozen encoder (~23%) stays near useless features.</w:t>
+      </w:r>
+    </w:p>
+    <w:p>
+      <w:pPr>
+        <w:pStyle w:val="Normal"/>
+        <w:rPr/>
+      </w:pPr>
+      <w:r>
+        <w:rPr/>
+      </w:r>
+    </w:p>
+    <w:p>
+      <w:pPr>
         <w:pStyle w:val="Heading1"/>
         <w:rPr/>
       </w:pPr>
@@ -2350,6 +4152,205 @@
       <w:r>
         <w:rPr/>
         <w:t>Insert random encoder, SimCLR encoder, and fine-tuned encoder PCA/t-SNE plots and discuss class grouping.</w:t>
+      </w:r>
+    </w:p>
+    <w:p>
+      <w:pPr>
+        <w:pStyle w:val="Normal"/>
+        <w:rPr/>
+      </w:pPr>
+      <w:r>
+        <w:rPr/>
+        <w:drawing>
+          <wp:anchor behindDoc="0" distT="0" distB="0" distL="0" distR="0" simplePos="0" locked="0" layoutInCell="0" allowOverlap="1" relativeHeight="10">
+            <wp:simplePos x="0" y="0"/>
+            <wp:positionH relativeFrom="column">
+              <wp:align>center</wp:align>
+            </wp:positionH>
+            <wp:positionV relativeFrom="paragraph">
+              <wp:posOffset>635</wp:posOffset>
+            </wp:positionV>
+            <wp:extent cx="6400800" cy="5106670"/>
+            <wp:effectExtent l="0" t="0" r="0" b="0"/>
+            <wp:wrapSquare wrapText="largest"/>
+            <wp:docPr id="9" name="Image9" descr=""/>
+            <wp:cNvGraphicFramePr>
+              <a:graphicFrameLocks xmlns:a="http://schemas.openxmlformats.org/drawingml/2006/main" noChangeAspect="1"/>
+            </wp:cNvGraphicFramePr>
+            <a:graphic xmlns:a="http://schemas.openxmlformats.org/drawingml/2006/main">
+              <a:graphicData uri="http://schemas.openxmlformats.org/drawingml/2006/picture">
+                <pic:pic xmlns:pic="http://schemas.openxmlformats.org/drawingml/2006/picture">
+                  <pic:nvPicPr>
+                    <pic:cNvPr id="9" name="Image9" descr=""/>
+                    <pic:cNvPicPr>
+                      <a:picLocks noChangeAspect="1" noChangeArrowheads="1"/>
+                    </pic:cNvPicPr>
+                  </pic:nvPicPr>
+                  <pic:blipFill>
+                    <a:blip r:embed="rId10"/>
+                    <a:stretch>
+                      <a:fillRect/>
+                    </a:stretch>
+                  </pic:blipFill>
+                  <pic:spPr bwMode="auto">
+                    <a:xfrm>
+                      <a:off x="0" y="0"/>
+                      <a:ext cx="6400800" cy="5106670"/>
+                    </a:xfrm>
+                    <a:prstGeom prst="rect">
+                      <a:avLst/>
+                    </a:prstGeom>
+                  </pic:spPr>
+                </pic:pic>
+              </a:graphicData>
+            </a:graphic>
+          </wp:anchor>
+        </w:drawing>
+      </w:r>
+    </w:p>
+    <w:p>
+      <w:pPr>
+        <w:pStyle w:val="Normal"/>
+        <w:rPr/>
+      </w:pPr>
+      <w:r>
+        <w:rPr/>
+      </w:r>
+    </w:p>
+    <w:p>
+      <w:pPr>
+        <w:pStyle w:val="Normal"/>
+        <w:rPr/>
+      </w:pPr>
+      <w:r>
+        <w:rPr/>
+        <w:drawing>
+          <wp:anchor behindDoc="0" distT="0" distB="0" distL="0" distR="0" simplePos="0" locked="0" layoutInCell="0" allowOverlap="1" relativeHeight="11">
+            <wp:simplePos x="0" y="0"/>
+            <wp:positionH relativeFrom="column">
+              <wp:align>center</wp:align>
+            </wp:positionH>
+            <wp:positionV relativeFrom="paragraph">
+              <wp:posOffset>635</wp:posOffset>
+            </wp:positionV>
+            <wp:extent cx="6400800" cy="5106670"/>
+            <wp:effectExtent l="0" t="0" r="0" b="0"/>
+            <wp:wrapSquare wrapText="largest"/>
+            <wp:docPr id="10" name="Image10" descr=""/>
+            <wp:cNvGraphicFramePr>
+              <a:graphicFrameLocks xmlns:a="http://schemas.openxmlformats.org/drawingml/2006/main" noChangeAspect="1"/>
+            </wp:cNvGraphicFramePr>
+            <a:graphic xmlns:a="http://schemas.openxmlformats.org/drawingml/2006/main">
+              <a:graphicData uri="http://schemas.openxmlformats.org/drawingml/2006/picture">
+                <pic:pic xmlns:pic="http://schemas.openxmlformats.org/drawingml/2006/picture">
+                  <pic:nvPicPr>
+                    <pic:cNvPr id="10" name="Image10" descr=""/>
+                    <pic:cNvPicPr>
+                      <a:picLocks noChangeAspect="1" noChangeArrowheads="1"/>
+                    </pic:cNvPicPr>
+                  </pic:nvPicPr>
+                  <pic:blipFill>
+                    <a:blip r:embed="rId11"/>
+                    <a:stretch>
+                      <a:fillRect/>
+                    </a:stretch>
+                  </pic:blipFill>
+                  <pic:spPr bwMode="auto">
+                    <a:xfrm>
+                      <a:off x="0" y="0"/>
+                      <a:ext cx="6400800" cy="5106670"/>
+                    </a:xfrm>
+                    <a:prstGeom prst="rect">
+                      <a:avLst/>
+                    </a:prstGeom>
+                  </pic:spPr>
+                </pic:pic>
+              </a:graphicData>
+            </a:graphic>
+          </wp:anchor>
+        </w:drawing>
+      </w:r>
+    </w:p>
+    <w:p>
+      <w:pPr>
+        <w:pStyle w:val="Normal"/>
+        <w:rPr/>
+      </w:pPr>
+      <w:r>
+        <w:rPr/>
+        <w:drawing>
+          <wp:anchor behindDoc="0" distT="0" distB="0" distL="0" distR="0" simplePos="0" locked="0" layoutInCell="0" allowOverlap="1" relativeHeight="12">
+            <wp:simplePos x="0" y="0"/>
+            <wp:positionH relativeFrom="column">
+              <wp:align>center</wp:align>
+            </wp:positionH>
+            <wp:positionV relativeFrom="paragraph">
+              <wp:posOffset>635</wp:posOffset>
+            </wp:positionV>
+            <wp:extent cx="6400800" cy="5106670"/>
+            <wp:effectExtent l="0" t="0" r="0" b="0"/>
+            <wp:wrapSquare wrapText="largest"/>
+            <wp:docPr id="11" name="Image11" descr=""/>
+            <wp:cNvGraphicFramePr>
+              <a:graphicFrameLocks xmlns:a="http://schemas.openxmlformats.org/drawingml/2006/main" noChangeAspect="1"/>
+            </wp:cNvGraphicFramePr>
+            <a:graphic xmlns:a="http://schemas.openxmlformats.org/drawingml/2006/main">
+              <a:graphicData uri="http://schemas.openxmlformats.org/drawingml/2006/picture">
+                <pic:pic xmlns:pic="http://schemas.openxmlformats.org/drawingml/2006/picture">
+                  <pic:nvPicPr>
+                    <pic:cNvPr id="11" name="Image11" descr=""/>
+                    <pic:cNvPicPr>
+                      <a:picLocks noChangeAspect="1" noChangeArrowheads="1"/>
+                    </pic:cNvPicPr>
+                  </pic:nvPicPr>
+                  <pic:blipFill>
+                    <a:blip r:embed="rId12"/>
+                    <a:stretch>
+                      <a:fillRect/>
+                    </a:stretch>
+                  </pic:blipFill>
+                  <pic:spPr bwMode="auto">
+                    <a:xfrm>
+                      <a:off x="0" y="0"/>
+                      <a:ext cx="6400800" cy="5106670"/>
+                    </a:xfrm>
+                    <a:prstGeom prst="rect">
+                      <a:avLst/>
+                    </a:prstGeom>
+                  </pic:spPr>
+                </pic:pic>
+              </a:graphicData>
+            </a:graphic>
+          </wp:anchor>
+        </w:drawing>
+      </w:r>
+    </w:p>
+    <w:p>
+      <w:pPr>
+        <w:pStyle w:val="Normal"/>
+        <w:widowControl/>
+        <w:ind w:left="0" w:right="0" w:hanging="0"/>
+        <w:rPr>
+          <w:rFonts w:ascii="system-ui;Ubuntu;Droid Sans;sans-serif" w:hAnsi="system-ui;Ubuntu;Droid Sans;sans-serif"/>
+          <w:b w:val="false"/>
+          <w:i w:val="false"/>
+          <w:caps w:val="false"/>
+          <w:smallCaps w:val="false"/>
+          <w:spacing w:val="0"/>
+          <w:sz w:val="20"/>
+        </w:rPr>
+      </w:pPr>
+      <w:r>
+        <w:rPr>
+          <w:rFonts w:ascii="system-ui;Ubuntu;Droid Sans;sans-serif" w:hAnsi="system-ui;Ubuntu;Droid Sans;sans-serif"/>
+          <w:b w:val="false"/>
+          <w:i w:val="false"/>
+          <w:caps w:val="false"/>
+          <w:smallCaps w:val="false"/>
+          <w:spacing w:val="0"/>
+          <w:sz w:val="20"/>
+        </w:rPr>
+        <w:t>Random encoder → weak/mixed clusters; SimCLR → clearer class groups; fine-tuned → tightest separation (1000 val samples, t-SNE).</w:t>
       </w:r>
     </w:p>
     <w:p>
@@ -2374,6 +4375,102 @@
       <w:r>
         <w:rPr/>
         <w:t>Discuss what worked, what did not work, and what you learned about self-supervised learning.</w:t>
+      </w:r>
+    </w:p>
+    <w:p>
+      <w:pPr>
+        <w:pStyle w:val="TextBody"/>
+        <w:numPr>
+          <w:ilvl w:val="0"/>
+          <w:numId w:val="14"/>
+        </w:numPr>
+        <w:pBdr/>
+        <w:tabs>
+          <w:tab w:val="clear" w:pos="720"/>
+          <w:tab w:val="left" w:pos="0" w:leader="none"/>
+        </w:tabs>
+        <w:spacing w:before="0" w:after="0"/>
+        <w:ind w:left="709" w:hanging="283"/>
+        <w:rPr/>
+      </w:pPr>
+      <w:r>
+        <w:rPr/>
+        <w:t>Self-supervised pretraining helps when labels are scarce.</w:t>
+      </w:r>
+    </w:p>
+    <w:p>
+      <w:pPr>
+        <w:pStyle w:val="TextBody"/>
+        <w:numPr>
+          <w:ilvl w:val="0"/>
+          <w:numId w:val="14"/>
+        </w:numPr>
+        <w:pBdr/>
+        <w:tabs>
+          <w:tab w:val="clear" w:pos="720"/>
+          <w:tab w:val="left" w:pos="0" w:leader="none"/>
+        </w:tabs>
+        <w:spacing w:before="0" w:after="0"/>
+        <w:ind w:left="709" w:hanging="283"/>
+        <w:rPr/>
+      </w:pPr>
+      <w:r>
+        <w:rPr/>
+        <w:t>Similarity before/after shows the encoder learned structure without labels.</w:t>
+      </w:r>
+    </w:p>
+    <w:p>
+      <w:pPr>
+        <w:pStyle w:val="TextBody"/>
+        <w:numPr>
+          <w:ilvl w:val="0"/>
+          <w:numId w:val="14"/>
+        </w:numPr>
+        <w:pBdr/>
+        <w:tabs>
+          <w:tab w:val="clear" w:pos="720"/>
+          <w:tab w:val="left" w:pos="0" w:leader="none"/>
+        </w:tabs>
+        <w:spacing w:before="0" w:after="0"/>
+        <w:ind w:left="709" w:hanging="283"/>
+        <w:rPr/>
+      </w:pPr>
+      <w:r>
+        <w:rPr/>
+        <w:t>Fine-tuning gives the highest accuracy (81.67%).</w:t>
+      </w:r>
+    </w:p>
+    <w:p>
+      <w:pPr>
+        <w:pStyle w:val="TextBody"/>
+        <w:numPr>
+          <w:ilvl w:val="0"/>
+          <w:numId w:val="14"/>
+        </w:numPr>
+        <w:pBdr/>
+        <w:tabs>
+          <w:tab w:val="clear" w:pos="720"/>
+          <w:tab w:val="left" w:pos="0" w:leader="none"/>
+        </w:tabs>
+        <w:ind w:left="709" w:hanging="283"/>
+        <w:rPr/>
+      </w:pPr>
+      <w:r>
+        <w:rPr/>
+        <w:t>Limitations: only 10% labels, CIFAR-10 only, 50 SimCLR epochs, loss still ~6.4 (not fully converged), t-SNE is qualitative, compute time (~3 h pretrain alone).</w:t>
+      </w:r>
+    </w:p>
+    <w:p>
+      <w:pPr>
+        <w:pStyle w:val="Normal"/>
+        <w:widowControl/>
+        <w:bidi w:val="0"/>
+        <w:spacing w:lineRule="auto" w:line="276" w:before="0" w:after="200"/>
+        <w:jc w:val="left"/>
+        <w:rPr/>
+      </w:pPr>
+      <w:r>
+        <w:rPr/>
       </w:r>
     </w:p>
     <w:sectPr>
@@ -3523,6 +5620,691 @@
     </w:lvl>
   </w:abstractNum>
   <w:abstractNum w:abstractNumId="10">
+    <w:lvl w:ilvl="0">
+      <w:start w:val="1"/>
+      <w:numFmt w:val="bullet"/>
+      <w:lvlText w:val=""/>
+      <w:lvlJc w:val="left"/>
+      <w:pPr>
+        <w:tabs>
+          <w:tab w:val="num" w:pos="709"/>
+        </w:tabs>
+        <w:ind w:left="709" w:hanging="283"/>
+      </w:pPr>
+      <w:rPr>
+        <w:rFonts w:ascii="Symbol" w:hAnsi="Symbol" w:cs="Symbol" w:hint="default"/>
+      </w:rPr>
+    </w:lvl>
+    <w:lvl w:ilvl="1">
+      <w:start w:val="1"/>
+      <w:numFmt w:val="bullet"/>
+      <w:lvlText w:val=""/>
+      <w:lvlJc w:val="left"/>
+      <w:pPr>
+        <w:tabs>
+          <w:tab w:val="num" w:pos="1418"/>
+        </w:tabs>
+        <w:ind w:left="1418" w:hanging="283"/>
+      </w:pPr>
+      <w:rPr>
+        <w:rFonts w:ascii="Symbol" w:hAnsi="Symbol" w:cs="Symbol" w:hint="default"/>
+      </w:rPr>
+    </w:lvl>
+    <w:lvl w:ilvl="2">
+      <w:start w:val="1"/>
+      <w:numFmt w:val="bullet"/>
+      <w:lvlText w:val=""/>
+      <w:lvlJc w:val="left"/>
+      <w:pPr>
+        <w:tabs>
+          <w:tab w:val="num" w:pos="2127"/>
+        </w:tabs>
+        <w:ind w:left="2127" w:hanging="283"/>
+      </w:pPr>
+      <w:rPr>
+        <w:rFonts w:ascii="Symbol" w:hAnsi="Symbol" w:cs="Symbol" w:hint="default"/>
+      </w:rPr>
+    </w:lvl>
+    <w:lvl w:ilvl="3">
+      <w:start w:val="1"/>
+      <w:numFmt w:val="bullet"/>
+      <w:lvlText w:val=""/>
+      <w:lvlJc w:val="left"/>
+      <w:pPr>
+        <w:tabs>
+          <w:tab w:val="num" w:pos="2836"/>
+        </w:tabs>
+        <w:ind w:left="2836" w:hanging="283"/>
+      </w:pPr>
+      <w:rPr>
+        <w:rFonts w:ascii="Symbol" w:hAnsi="Symbol" w:cs="Symbol" w:hint="default"/>
+      </w:rPr>
+    </w:lvl>
+    <w:lvl w:ilvl="4">
+      <w:start w:val="1"/>
+      <w:numFmt w:val="bullet"/>
+      <w:lvlText w:val=""/>
+      <w:lvlJc w:val="left"/>
+      <w:pPr>
+        <w:tabs>
+          <w:tab w:val="num" w:pos="3545"/>
+        </w:tabs>
+        <w:ind w:left="3545" w:hanging="283"/>
+      </w:pPr>
+      <w:rPr>
+        <w:rFonts w:ascii="Symbol" w:hAnsi="Symbol" w:cs="Symbol" w:hint="default"/>
+      </w:rPr>
+    </w:lvl>
+    <w:lvl w:ilvl="5">
+      <w:start w:val="1"/>
+      <w:numFmt w:val="bullet"/>
+      <w:lvlText w:val=""/>
+      <w:lvlJc w:val="left"/>
+      <w:pPr>
+        <w:tabs>
+          <w:tab w:val="num" w:pos="4254"/>
+        </w:tabs>
+        <w:ind w:left="4254" w:hanging="283"/>
+      </w:pPr>
+      <w:rPr>
+        <w:rFonts w:ascii="Symbol" w:hAnsi="Symbol" w:cs="Symbol" w:hint="default"/>
+      </w:rPr>
+    </w:lvl>
+    <w:lvl w:ilvl="6">
+      <w:start w:val="1"/>
+      <w:numFmt w:val="bullet"/>
+      <w:lvlText w:val=""/>
+      <w:lvlJc w:val="left"/>
+      <w:pPr>
+        <w:tabs>
+          <w:tab w:val="num" w:pos="4963"/>
+        </w:tabs>
+        <w:ind w:left="4963" w:hanging="283"/>
+      </w:pPr>
+      <w:rPr>
+        <w:rFonts w:ascii="Symbol" w:hAnsi="Symbol" w:cs="Symbol" w:hint="default"/>
+      </w:rPr>
+    </w:lvl>
+    <w:lvl w:ilvl="7">
+      <w:start w:val="1"/>
+      <w:numFmt w:val="bullet"/>
+      <w:lvlText w:val=""/>
+      <w:lvlJc w:val="left"/>
+      <w:pPr>
+        <w:tabs>
+          <w:tab w:val="num" w:pos="5672"/>
+        </w:tabs>
+        <w:ind w:left="5672" w:hanging="283"/>
+      </w:pPr>
+      <w:rPr>
+        <w:rFonts w:ascii="Symbol" w:hAnsi="Symbol" w:cs="Symbol" w:hint="default"/>
+      </w:rPr>
+    </w:lvl>
+    <w:lvl w:ilvl="8">
+      <w:start w:val="1"/>
+      <w:numFmt w:val="bullet"/>
+      <w:lvlText w:val=""/>
+      <w:lvlJc w:val="left"/>
+      <w:pPr>
+        <w:tabs>
+          <w:tab w:val="num" w:pos="6381"/>
+        </w:tabs>
+        <w:ind w:left="6381" w:hanging="283"/>
+      </w:pPr>
+      <w:rPr>
+        <w:rFonts w:ascii="Symbol" w:hAnsi="Symbol" w:cs="Symbol" w:hint="default"/>
+      </w:rPr>
+    </w:lvl>
+  </w:abstractNum>
+  <w:abstractNum w:abstractNumId="11">
+    <w:lvl w:ilvl="0">
+      <w:start w:val="1"/>
+      <w:numFmt w:val="bullet"/>
+      <w:lvlText w:val=""/>
+      <w:lvlJc w:val="left"/>
+      <w:pPr>
+        <w:tabs>
+          <w:tab w:val="num" w:pos="709"/>
+        </w:tabs>
+        <w:ind w:left="709" w:hanging="283"/>
+      </w:pPr>
+      <w:rPr>
+        <w:rFonts w:ascii="Symbol" w:hAnsi="Symbol" w:cs="Symbol" w:hint="default"/>
+      </w:rPr>
+    </w:lvl>
+    <w:lvl w:ilvl="1">
+      <w:start w:val="1"/>
+      <w:numFmt w:val="bullet"/>
+      <w:lvlText w:val=""/>
+      <w:lvlJc w:val="left"/>
+      <w:pPr>
+        <w:tabs>
+          <w:tab w:val="num" w:pos="1418"/>
+        </w:tabs>
+        <w:ind w:left="1418" w:hanging="283"/>
+      </w:pPr>
+      <w:rPr>
+        <w:rFonts w:ascii="Symbol" w:hAnsi="Symbol" w:cs="Symbol" w:hint="default"/>
+      </w:rPr>
+    </w:lvl>
+    <w:lvl w:ilvl="2">
+      <w:start w:val="1"/>
+      <w:numFmt w:val="bullet"/>
+      <w:lvlText w:val=""/>
+      <w:lvlJc w:val="left"/>
+      <w:pPr>
+        <w:tabs>
+          <w:tab w:val="num" w:pos="2127"/>
+        </w:tabs>
+        <w:ind w:left="2127" w:hanging="283"/>
+      </w:pPr>
+      <w:rPr>
+        <w:rFonts w:ascii="Symbol" w:hAnsi="Symbol" w:cs="Symbol" w:hint="default"/>
+      </w:rPr>
+    </w:lvl>
+    <w:lvl w:ilvl="3">
+      <w:start w:val="1"/>
+      <w:numFmt w:val="bullet"/>
+      <w:lvlText w:val=""/>
+      <w:lvlJc w:val="left"/>
+      <w:pPr>
+        <w:tabs>
+          <w:tab w:val="num" w:pos="2836"/>
+        </w:tabs>
+        <w:ind w:left="2836" w:hanging="283"/>
+      </w:pPr>
+      <w:rPr>
+        <w:rFonts w:ascii="Symbol" w:hAnsi="Symbol" w:cs="Symbol" w:hint="default"/>
+      </w:rPr>
+    </w:lvl>
+    <w:lvl w:ilvl="4">
+      <w:start w:val="1"/>
+      <w:numFmt w:val="bullet"/>
+      <w:lvlText w:val=""/>
+      <w:lvlJc w:val="left"/>
+      <w:pPr>
+        <w:tabs>
+          <w:tab w:val="num" w:pos="3545"/>
+        </w:tabs>
+        <w:ind w:left="3545" w:hanging="283"/>
+      </w:pPr>
+      <w:rPr>
+        <w:rFonts w:ascii="Symbol" w:hAnsi="Symbol" w:cs="Symbol" w:hint="default"/>
+      </w:rPr>
+    </w:lvl>
+    <w:lvl w:ilvl="5">
+      <w:start w:val="1"/>
+      <w:numFmt w:val="bullet"/>
+      <w:lvlText w:val=""/>
+      <w:lvlJc w:val="left"/>
+      <w:pPr>
+        <w:tabs>
+          <w:tab w:val="num" w:pos="4254"/>
+        </w:tabs>
+        <w:ind w:left="4254" w:hanging="283"/>
+      </w:pPr>
+      <w:rPr>
+        <w:rFonts w:ascii="Symbol" w:hAnsi="Symbol" w:cs="Symbol" w:hint="default"/>
+      </w:rPr>
+    </w:lvl>
+    <w:lvl w:ilvl="6">
+      <w:start w:val="1"/>
+      <w:numFmt w:val="bullet"/>
+      <w:lvlText w:val=""/>
+      <w:lvlJc w:val="left"/>
+      <w:pPr>
+        <w:tabs>
+          <w:tab w:val="num" w:pos="4963"/>
+        </w:tabs>
+        <w:ind w:left="4963" w:hanging="283"/>
+      </w:pPr>
+      <w:rPr>
+        <w:rFonts w:ascii="Symbol" w:hAnsi="Symbol" w:cs="Symbol" w:hint="default"/>
+      </w:rPr>
+    </w:lvl>
+    <w:lvl w:ilvl="7">
+      <w:start w:val="1"/>
+      <w:numFmt w:val="bullet"/>
+      <w:lvlText w:val=""/>
+      <w:lvlJc w:val="left"/>
+      <w:pPr>
+        <w:tabs>
+          <w:tab w:val="num" w:pos="5672"/>
+        </w:tabs>
+        <w:ind w:left="5672" w:hanging="283"/>
+      </w:pPr>
+      <w:rPr>
+        <w:rFonts w:ascii="Symbol" w:hAnsi="Symbol" w:cs="Symbol" w:hint="default"/>
+      </w:rPr>
+    </w:lvl>
+    <w:lvl w:ilvl="8">
+      <w:start w:val="1"/>
+      <w:numFmt w:val="bullet"/>
+      <w:lvlText w:val=""/>
+      <w:lvlJc w:val="left"/>
+      <w:pPr>
+        <w:tabs>
+          <w:tab w:val="num" w:pos="6381"/>
+        </w:tabs>
+        <w:ind w:left="6381" w:hanging="283"/>
+      </w:pPr>
+      <w:rPr>
+        <w:rFonts w:ascii="Symbol" w:hAnsi="Symbol" w:cs="Symbol" w:hint="default"/>
+      </w:rPr>
+    </w:lvl>
+  </w:abstractNum>
+  <w:abstractNum w:abstractNumId="12">
+    <w:lvl w:ilvl="0">
+      <w:start w:val="1"/>
+      <w:numFmt w:val="bullet"/>
+      <w:lvlText w:val=""/>
+      <w:lvlJc w:val="left"/>
+      <w:pPr>
+        <w:tabs>
+          <w:tab w:val="num" w:pos="709"/>
+        </w:tabs>
+        <w:ind w:left="709" w:hanging="283"/>
+      </w:pPr>
+      <w:rPr>
+        <w:rFonts w:ascii="Symbol" w:hAnsi="Symbol" w:cs="Symbol" w:hint="default"/>
+      </w:rPr>
+    </w:lvl>
+    <w:lvl w:ilvl="1">
+      <w:start w:val="1"/>
+      <w:numFmt w:val="bullet"/>
+      <w:lvlText w:val=""/>
+      <w:lvlJc w:val="left"/>
+      <w:pPr>
+        <w:tabs>
+          <w:tab w:val="num" w:pos="1418"/>
+        </w:tabs>
+        <w:ind w:left="1418" w:hanging="283"/>
+      </w:pPr>
+      <w:rPr>
+        <w:rFonts w:ascii="Symbol" w:hAnsi="Symbol" w:cs="Symbol" w:hint="default"/>
+      </w:rPr>
+    </w:lvl>
+    <w:lvl w:ilvl="2">
+      <w:start w:val="1"/>
+      <w:numFmt w:val="bullet"/>
+      <w:lvlText w:val=""/>
+      <w:lvlJc w:val="left"/>
+      <w:pPr>
+        <w:tabs>
+          <w:tab w:val="num" w:pos="2127"/>
+        </w:tabs>
+        <w:ind w:left="2127" w:hanging="283"/>
+      </w:pPr>
+      <w:rPr>
+        <w:rFonts w:ascii="Symbol" w:hAnsi="Symbol" w:cs="Symbol" w:hint="default"/>
+      </w:rPr>
+    </w:lvl>
+    <w:lvl w:ilvl="3">
+      <w:start w:val="1"/>
+      <w:numFmt w:val="bullet"/>
+      <w:lvlText w:val=""/>
+      <w:lvlJc w:val="left"/>
+      <w:pPr>
+        <w:tabs>
+          <w:tab w:val="num" w:pos="2836"/>
+        </w:tabs>
+        <w:ind w:left="2836" w:hanging="283"/>
+      </w:pPr>
+      <w:rPr>
+        <w:rFonts w:ascii="Symbol" w:hAnsi="Symbol" w:cs="Symbol" w:hint="default"/>
+      </w:rPr>
+    </w:lvl>
+    <w:lvl w:ilvl="4">
+      <w:start w:val="1"/>
+      <w:numFmt w:val="bullet"/>
+      <w:lvlText w:val=""/>
+      <w:lvlJc w:val="left"/>
+      <w:pPr>
+        <w:tabs>
+          <w:tab w:val="num" w:pos="3545"/>
+        </w:tabs>
+        <w:ind w:left="3545" w:hanging="283"/>
+      </w:pPr>
+      <w:rPr>
+        <w:rFonts w:ascii="Symbol" w:hAnsi="Symbol" w:cs="Symbol" w:hint="default"/>
+      </w:rPr>
+    </w:lvl>
+    <w:lvl w:ilvl="5">
+      <w:start w:val="1"/>
+      <w:numFmt w:val="bullet"/>
+      <w:lvlText w:val=""/>
+      <w:lvlJc w:val="left"/>
+      <w:pPr>
+        <w:tabs>
+          <w:tab w:val="num" w:pos="4254"/>
+        </w:tabs>
+        <w:ind w:left="4254" w:hanging="283"/>
+      </w:pPr>
+      <w:rPr>
+        <w:rFonts w:ascii="Symbol" w:hAnsi="Symbol" w:cs="Symbol" w:hint="default"/>
+      </w:rPr>
+    </w:lvl>
+    <w:lvl w:ilvl="6">
+      <w:start w:val="1"/>
+      <w:numFmt w:val="bullet"/>
+      <w:lvlText w:val=""/>
+      <w:lvlJc w:val="left"/>
+      <w:pPr>
+        <w:tabs>
+          <w:tab w:val="num" w:pos="4963"/>
+        </w:tabs>
+        <w:ind w:left="4963" w:hanging="283"/>
+      </w:pPr>
+      <w:rPr>
+        <w:rFonts w:ascii="Symbol" w:hAnsi="Symbol" w:cs="Symbol" w:hint="default"/>
+      </w:rPr>
+    </w:lvl>
+    <w:lvl w:ilvl="7">
+      <w:start w:val="1"/>
+      <w:numFmt w:val="bullet"/>
+      <w:lvlText w:val=""/>
+      <w:lvlJc w:val="left"/>
+      <w:pPr>
+        <w:tabs>
+          <w:tab w:val="num" w:pos="5672"/>
+        </w:tabs>
+        <w:ind w:left="5672" w:hanging="283"/>
+      </w:pPr>
+      <w:rPr>
+        <w:rFonts w:ascii="Symbol" w:hAnsi="Symbol" w:cs="Symbol" w:hint="default"/>
+      </w:rPr>
+    </w:lvl>
+    <w:lvl w:ilvl="8">
+      <w:start w:val="1"/>
+      <w:numFmt w:val="bullet"/>
+      <w:lvlText w:val=""/>
+      <w:lvlJc w:val="left"/>
+      <w:pPr>
+        <w:tabs>
+          <w:tab w:val="num" w:pos="6381"/>
+        </w:tabs>
+        <w:ind w:left="6381" w:hanging="283"/>
+      </w:pPr>
+      <w:rPr>
+        <w:rFonts w:ascii="Symbol" w:hAnsi="Symbol" w:cs="Symbol" w:hint="default"/>
+      </w:rPr>
+    </w:lvl>
+  </w:abstractNum>
+  <w:abstractNum w:abstractNumId="13">
+    <w:lvl w:ilvl="0">
+      <w:start w:val="1"/>
+      <w:numFmt w:val="bullet"/>
+      <w:lvlText w:val=""/>
+      <w:lvlJc w:val="left"/>
+      <w:pPr>
+        <w:tabs>
+          <w:tab w:val="num" w:pos="709"/>
+        </w:tabs>
+        <w:ind w:left="709" w:hanging="283"/>
+      </w:pPr>
+      <w:rPr>
+        <w:rFonts w:ascii="Symbol" w:hAnsi="Symbol" w:cs="Symbol" w:hint="default"/>
+      </w:rPr>
+    </w:lvl>
+    <w:lvl w:ilvl="1">
+      <w:start w:val="1"/>
+      <w:numFmt w:val="bullet"/>
+      <w:lvlText w:val=""/>
+      <w:lvlJc w:val="left"/>
+      <w:pPr>
+        <w:tabs>
+          <w:tab w:val="num" w:pos="1418"/>
+        </w:tabs>
+        <w:ind w:left="1418" w:hanging="283"/>
+      </w:pPr>
+      <w:rPr>
+        <w:rFonts w:ascii="Symbol" w:hAnsi="Symbol" w:cs="Symbol" w:hint="default"/>
+      </w:rPr>
+    </w:lvl>
+    <w:lvl w:ilvl="2">
+      <w:start w:val="1"/>
+      <w:numFmt w:val="bullet"/>
+      <w:lvlText w:val=""/>
+      <w:lvlJc w:val="left"/>
+      <w:pPr>
+        <w:tabs>
+          <w:tab w:val="num" w:pos="2127"/>
+        </w:tabs>
+        <w:ind w:left="2127" w:hanging="283"/>
+      </w:pPr>
+      <w:rPr>
+        <w:rFonts w:ascii="Symbol" w:hAnsi="Symbol" w:cs="Symbol" w:hint="default"/>
+      </w:rPr>
+    </w:lvl>
+    <w:lvl w:ilvl="3">
+      <w:start w:val="1"/>
+      <w:numFmt w:val="bullet"/>
+      <w:lvlText w:val=""/>
+      <w:lvlJc w:val="left"/>
+      <w:pPr>
+        <w:tabs>
+          <w:tab w:val="num" w:pos="2836"/>
+        </w:tabs>
+        <w:ind w:left="2836" w:hanging="283"/>
+      </w:pPr>
+      <w:rPr>
+        <w:rFonts w:ascii="Symbol" w:hAnsi="Symbol" w:cs="Symbol" w:hint="default"/>
+      </w:rPr>
+    </w:lvl>
+    <w:lvl w:ilvl="4">
+      <w:start w:val="1"/>
+      <w:numFmt w:val="bullet"/>
+      <w:lvlText w:val=""/>
+      <w:lvlJc w:val="left"/>
+      <w:pPr>
+        <w:tabs>
+          <w:tab w:val="num" w:pos="3545"/>
+        </w:tabs>
+        <w:ind w:left="3545" w:hanging="283"/>
+      </w:pPr>
+      <w:rPr>
+        <w:rFonts w:ascii="Symbol" w:hAnsi="Symbol" w:cs="Symbol" w:hint="default"/>
+      </w:rPr>
+    </w:lvl>
+    <w:lvl w:ilvl="5">
+      <w:start w:val="1"/>
+      <w:numFmt w:val="bullet"/>
+      <w:lvlText w:val=""/>
+      <w:lvlJc w:val="left"/>
+      <w:pPr>
+        <w:tabs>
+          <w:tab w:val="num" w:pos="4254"/>
+        </w:tabs>
+        <w:ind w:left="4254" w:hanging="283"/>
+      </w:pPr>
+      <w:rPr>
+        <w:rFonts w:ascii="Symbol" w:hAnsi="Symbol" w:cs="Symbol" w:hint="default"/>
+      </w:rPr>
+    </w:lvl>
+    <w:lvl w:ilvl="6">
+      <w:start w:val="1"/>
+      <w:numFmt w:val="bullet"/>
+      <w:lvlText w:val=""/>
+      <w:lvlJc w:val="left"/>
+      <w:pPr>
+        <w:tabs>
+          <w:tab w:val="num" w:pos="4963"/>
+        </w:tabs>
+        <w:ind w:left="4963" w:hanging="283"/>
+      </w:pPr>
+      <w:rPr>
+        <w:rFonts w:ascii="Symbol" w:hAnsi="Symbol" w:cs="Symbol" w:hint="default"/>
+      </w:rPr>
+    </w:lvl>
+    <w:lvl w:ilvl="7">
+      <w:start w:val="1"/>
+      <w:numFmt w:val="bullet"/>
+      <w:lvlText w:val=""/>
+      <w:lvlJc w:val="left"/>
+      <w:pPr>
+        <w:tabs>
+          <w:tab w:val="num" w:pos="5672"/>
+        </w:tabs>
+        <w:ind w:left="5672" w:hanging="283"/>
+      </w:pPr>
+      <w:rPr>
+        <w:rFonts w:ascii="Symbol" w:hAnsi="Symbol" w:cs="Symbol" w:hint="default"/>
+      </w:rPr>
+    </w:lvl>
+    <w:lvl w:ilvl="8">
+      <w:start w:val="1"/>
+      <w:numFmt w:val="bullet"/>
+      <w:lvlText w:val=""/>
+      <w:lvlJc w:val="left"/>
+      <w:pPr>
+        <w:tabs>
+          <w:tab w:val="num" w:pos="6381"/>
+        </w:tabs>
+        <w:ind w:left="6381" w:hanging="283"/>
+      </w:pPr>
+      <w:rPr>
+        <w:rFonts w:ascii="Symbol" w:hAnsi="Symbol" w:cs="Symbol" w:hint="default"/>
+      </w:rPr>
+    </w:lvl>
+  </w:abstractNum>
+  <w:abstractNum w:abstractNumId="14">
+    <w:lvl w:ilvl="0">
+      <w:start w:val="1"/>
+      <w:numFmt w:val="bullet"/>
+      <w:lvlText w:val=""/>
+      <w:lvlJc w:val="left"/>
+      <w:pPr>
+        <w:tabs>
+          <w:tab w:val="num" w:pos="709"/>
+        </w:tabs>
+        <w:ind w:left="709" w:hanging="283"/>
+      </w:pPr>
+      <w:rPr>
+        <w:rFonts w:ascii="Symbol" w:hAnsi="Symbol" w:cs="Symbol" w:hint="default"/>
+      </w:rPr>
+    </w:lvl>
+    <w:lvl w:ilvl="1">
+      <w:start w:val="1"/>
+      <w:numFmt w:val="bullet"/>
+      <w:lvlText w:val=""/>
+      <w:lvlJc w:val="left"/>
+      <w:pPr>
+        <w:tabs>
+          <w:tab w:val="num" w:pos="1418"/>
+        </w:tabs>
+        <w:ind w:left="1418" w:hanging="283"/>
+      </w:pPr>
+      <w:rPr>
+        <w:rFonts w:ascii="Symbol" w:hAnsi="Symbol" w:cs="Symbol" w:hint="default"/>
+      </w:rPr>
+    </w:lvl>
+    <w:lvl w:ilvl="2">
+      <w:start w:val="1"/>
+      <w:numFmt w:val="bullet"/>
+      <w:lvlText w:val=""/>
+      <w:lvlJc w:val="left"/>
+      <w:pPr>
+        <w:tabs>
+          <w:tab w:val="num" w:pos="2127"/>
+        </w:tabs>
+        <w:ind w:left="2127" w:hanging="283"/>
+      </w:pPr>
+      <w:rPr>
+        <w:rFonts w:ascii="Symbol" w:hAnsi="Symbol" w:cs="Symbol" w:hint="default"/>
+      </w:rPr>
+    </w:lvl>
+    <w:lvl w:ilvl="3">
+      <w:start w:val="1"/>
+      <w:numFmt w:val="bullet"/>
+      <w:lvlText w:val=""/>
+      <w:lvlJc w:val="left"/>
+      <w:pPr>
+        <w:tabs>
+          <w:tab w:val="num" w:pos="2836"/>
+        </w:tabs>
+        <w:ind w:left="2836" w:hanging="283"/>
+      </w:pPr>
+      <w:rPr>
+        <w:rFonts w:ascii="Symbol" w:hAnsi="Symbol" w:cs="Symbol" w:hint="default"/>
+      </w:rPr>
+    </w:lvl>
+    <w:lvl w:ilvl="4">
+      <w:start w:val="1"/>
+      <w:numFmt w:val="bullet"/>
+      <w:lvlText w:val=""/>
+      <w:lvlJc w:val="left"/>
+      <w:pPr>
+        <w:tabs>
+          <w:tab w:val="num" w:pos="3545"/>
+        </w:tabs>
+        <w:ind w:left="3545" w:hanging="283"/>
+      </w:pPr>
+      <w:rPr>
+        <w:rFonts w:ascii="Symbol" w:hAnsi="Symbol" w:cs="Symbol" w:hint="default"/>
+      </w:rPr>
+    </w:lvl>
+    <w:lvl w:ilvl="5">
+      <w:start w:val="1"/>
+      <w:numFmt w:val="bullet"/>
+      <w:lvlText w:val=""/>
+      <w:lvlJc w:val="left"/>
+      <w:pPr>
+        <w:tabs>
+          <w:tab w:val="num" w:pos="4254"/>
+        </w:tabs>
+        <w:ind w:left="4254" w:hanging="283"/>
+      </w:pPr>
+      <w:rPr>
+        <w:rFonts w:ascii="Symbol" w:hAnsi="Symbol" w:cs="Symbol" w:hint="default"/>
+      </w:rPr>
+    </w:lvl>
+    <w:lvl w:ilvl="6">
+      <w:start w:val="1"/>
+      <w:numFmt w:val="bullet"/>
+      <w:lvlText w:val=""/>
+      <w:lvlJc w:val="left"/>
+      <w:pPr>
+        <w:tabs>
+          <w:tab w:val="num" w:pos="4963"/>
+        </w:tabs>
+        <w:ind w:left="4963" w:hanging="283"/>
+      </w:pPr>
+      <w:rPr>
+        <w:rFonts w:ascii="Symbol" w:hAnsi="Symbol" w:cs="Symbol" w:hint="default"/>
+      </w:rPr>
+    </w:lvl>
+    <w:lvl w:ilvl="7">
+      <w:start w:val="1"/>
+      <w:numFmt w:val="bullet"/>
+      <w:lvlText w:val=""/>
+      <w:lvlJc w:val="left"/>
+      <w:pPr>
+        <w:tabs>
+          <w:tab w:val="num" w:pos="5672"/>
+        </w:tabs>
+        <w:ind w:left="5672" w:hanging="283"/>
+      </w:pPr>
+      <w:rPr>
+        <w:rFonts w:ascii="Symbol" w:hAnsi="Symbol" w:cs="Symbol" w:hint="default"/>
+      </w:rPr>
+    </w:lvl>
+    <w:lvl w:ilvl="8">
+      <w:start w:val="1"/>
+      <w:numFmt w:val="bullet"/>
+      <w:lvlText w:val=""/>
+      <w:lvlJc w:val="left"/>
+      <w:pPr>
+        <w:tabs>
+          <w:tab w:val="num" w:pos="6381"/>
+        </w:tabs>
+        <w:ind w:left="6381" w:hanging="283"/>
+      </w:pPr>
+      <w:rPr>
+        <w:rFonts w:ascii="Symbol" w:hAnsi="Symbol" w:cs="Symbol" w:hint="default"/>
+      </w:rPr>
+    </w:lvl>
+  </w:abstractNum>
+  <w:abstractNum w:abstractNumId="15">
     <w:lvl w:ilvl="0">
       <w:start w:val="1"/>
       <w:numFmt w:val="none"/>
@@ -3670,6 +6452,21 @@
   </w:num>
   <w:num w:numId="10">
     <w:abstractNumId w:val="10"/>
+  </w:num>
+  <w:num w:numId="11">
+    <w:abstractNumId w:val="11"/>
+  </w:num>
+  <w:num w:numId="12">
+    <w:abstractNumId w:val="12"/>
+  </w:num>
+  <w:num w:numId="13">
+    <w:abstractNumId w:val="13"/>
+  </w:num>
+  <w:num w:numId="14">
+    <w:abstractNumId w:val="14"/>
+  </w:num>
+  <w:num w:numId="15">
+    <w:abstractNumId w:val="15"/>
   </w:num>
 </w:numbering>
 </file>
@@ -4913,6 +7710,29 @@
     </w:pPr>
     <w:rPr/>
   </w:style>
+  <w:style w:type="paragraph" w:styleId="TableContents">
+    <w:name w:val="Table Contents"/>
+    <w:basedOn w:val="Normal"/>
+    <w:qFormat/>
+    <w:pPr>
+      <w:widowControl w:val="false"/>
+      <w:suppressLineNumbers/>
+    </w:pPr>
+    <w:rPr/>
+  </w:style>
+  <w:style w:type="paragraph" w:styleId="TableHeading">
+    <w:name w:val="Table Heading"/>
+    <w:basedOn w:val="TableContents"/>
+    <w:qFormat/>
+    <w:pPr>
+      <w:suppressLineNumbers/>
+      <w:jc w:val="center"/>
+    </w:pPr>
+    <w:rPr>
+      <w:b/>
+      <w:bCs/>
+    </w:rPr>
+  </w:style>
   <w:style w:type="numbering" w:styleId="NoList" w:default="1">
     <w:name w:val="No List"/>
     <w:uiPriority w:val="99"/>

</xml_diff>